<commit_message>
feat: Finished Sprint 2 & 3
</commit_message>
<xml_diff>
--- a/Technical Specification.docx
+++ b/Technical Specification.docx
@@ -2,6 +2,14 @@
 <file path=word/document.xml><?xml version="1.0" encoding="utf-8"?>
 <w:document xmlns:wpc="http://schemas.microsoft.com/office/word/2010/wordprocessingCanvas" xmlns:cx="http://schemas.microsoft.com/office/drawing/2014/chartex" xmlns:cx1="http://schemas.microsoft.com/office/drawing/2015/9/8/chartex" xmlns:cx2="http://schemas.microsoft.com/office/drawing/2015/10/21/chartex" xmlns:cx3="http://schemas.microsoft.com/office/drawing/2016/5/9/chartex" xmlns:cx4="http://schemas.microsoft.com/office/drawing/2016/5/10/chartex" xmlns:cx5="http://schemas.microsoft.com/office/drawing/2016/5/11/chartex" xmlns:cx6="http://schemas.microsoft.com/office/drawing/2016/5/12/chartex" xmlns:cx7="http://schemas.microsoft.com/office/drawing/2016/5/13/chartex" xmlns:cx8="http://schemas.microsoft.com/office/drawing/2016/5/14/chartex" xmlns:mc="http://schemas.openxmlformats.org/markup-compatibility/2006" xmlns:aink="http://schemas.microsoft.com/office/drawing/2016/ink" xmlns:am3d="http://schemas.microsoft.com/office/drawing/2017/model3d" xmlns:o="urn:schemas-microsoft-com:office:office" xmlns:oel="http://schemas.microsoft.com/office/2019/extlst" xmlns:r="http://schemas.openxmlformats.org/officeDocument/2006/relationships" xmlns:m="http://schemas.openxmlformats.org/officeDocument/2006/math" xmlns:v="urn:schemas-microsoft-com:vml" xmlns:wp14="http://schemas.microsoft.com/office/word/2010/wordprocessingDrawing" xmlns:wp="http://schemas.openxmlformats.org/drawingml/2006/wordprocessingDrawing" xmlns:w10="urn:schemas-microsoft-com:office:word" xmlns:w="http://schemas.openxmlformats.org/wordprocessingml/2006/main" xmlns:w14="http://schemas.microsoft.com/office/word/2010/wordml" xmlns:w15="http://schemas.microsoft.com/office/word/2012/wordml" xmlns:w16cex="http://schemas.microsoft.com/office/word/2018/wordml/cex" xmlns:w16cid="http://schemas.microsoft.com/office/word/2016/wordml/cid" xmlns:w16="http://schemas.microsoft.com/office/word/2018/wordml" xmlns:w16du="http://schemas.microsoft.com/office/word/2023/wordml/word16du" xmlns:w16sdtdh="http://schemas.microsoft.com/office/word/2020/wordml/sdtdatahash" xmlns:w16sdtfl="http://schemas.microsoft.com/office/word/2024/wordml/sdtformatlock" xmlns:w16se="http://schemas.microsoft.com/office/word/2015/wordml/symex" xmlns:wpg="http://schemas.microsoft.com/office/word/2010/wordprocessingGroup" xmlns:wpi="http://schemas.microsoft.com/office/word/2010/wordprocessingInk" xmlns:wne="http://schemas.microsoft.com/office/word/2006/wordml" xmlns:wps="http://schemas.microsoft.com/office/word/2010/wordprocessingShape" mc:Ignorable="w14 w15 w16se w16cid w16 w16cex w16sdtdh w16sdtfl w16du wp14">
   <w:body>
+    <w:p>
+      <w:pPr>
+        <w:pStyle w:val="Heading1"/>
+      </w:pPr>
+      <w:r>
+        <w:t>Organize</w:t>
+      </w:r>
+    </w:p>
     <w:p>
       <w:pPr>
         <w:pStyle w:val="Heading1"/>
@@ -9702,6 +9710,7 @@
   <w:style w:type="character" w:default="1" w:styleId="DefaultParagraphFont">
     <w:name w:val="Default Paragraph Font"/>
     <w:uiPriority w:val="1"/>
+    <w:semiHidden/>
     <w:unhideWhenUsed/>
   </w:style>
   <w:style w:type="table" w:default="1" w:styleId="TableNormal">

</xml_diff>

<commit_message>
feat: Finished Sprint 11
</commit_message>
<xml_diff>
--- a/Technical Specification.docx
+++ b/Technical Specification.docx
@@ -3273,19 +3273,30 @@
       </w:r>
     </w:p>
     <w:p>
+      <w:pPr>
+        <w:pStyle w:val="Heading2"/>
+      </w:pPr>
       <w:r>
         <w:t>Sprint 10: Testing, Optimization, and Release Preparation</w:t>
       </w:r>
-      <w:r>
-        <w:br/>
+    </w:p>
+    <w:p>
+      <w:pPr>
+        <w:pStyle w:val="Heading3"/>
+      </w:pPr>
+      <w:r>
         <w:t>Goals</w:t>
       </w:r>
-      <w:r>
-        <w:br/>
+    </w:p>
+    <w:p>
+      <w:r>
         <w:t>Ensure stability, performance, and readiness for production builds.</w:t>
       </w:r>
     </w:p>
     <w:p>
+      <w:pPr>
+        <w:pStyle w:val="Heading3"/>
+      </w:pPr>
       <w:r>
         <w:t>Tasks</w:t>
       </w:r>
@@ -3414,6 +3425,964 @@
         <w:t>None</w:t>
       </w:r>
     </w:p>
+    <w:p>
+      <w:pPr>
+        <w:pStyle w:val="Heading2"/>
+      </w:pPr>
+      <w:r>
+        <w:t>Sprint 1</w:t>
+      </w:r>
+      <w:r>
+        <w:t>1</w:t>
+      </w:r>
+      <w:r>
+        <w:t>: Packaging, Security Hardening, and Release Build</w:t>
+      </w:r>
+    </w:p>
+    <w:p>
+      <w:pPr>
+        <w:pStyle w:val="Heading3"/>
+      </w:pPr>
+      <w:r>
+        <w:t>Goals</w:t>
+      </w:r>
+    </w:p>
+    <w:p>
+      <w:r>
+        <w:t>Produce a production-ready Windows executable. Reduce size. Lock down permissions. Remove development risks.</w:t>
+      </w:r>
+    </w:p>
+    <w:p>
+      <w:pPr>
+        <w:pStyle w:val="Heading3"/>
+      </w:pPr>
+      <w:r>
+        <w:t>Tasks</w:t>
+      </w:r>
+    </w:p>
+    <w:p>
+      <w:pPr>
+        <w:numPr>
+          <w:ilvl w:val="0"/>
+          <w:numId w:val="50"/>
+        </w:numPr>
+      </w:pPr>
+      <w:r>
+        <w:t>Configure production Next.js build.</w:t>
+      </w:r>
+    </w:p>
+    <w:p>
+      <w:pPr>
+        <w:numPr>
+          <w:ilvl w:val="1"/>
+          <w:numId w:val="50"/>
+        </w:numPr>
+      </w:pPr>
+      <w:r>
+        <w:t>Enable static export.</w:t>
+      </w:r>
+    </w:p>
+    <w:p>
+      <w:pPr>
+        <w:numPr>
+          <w:ilvl w:val="1"/>
+          <w:numId w:val="50"/>
+        </w:numPr>
+      </w:pPr>
+      <w:r>
+        <w:lastRenderedPageBreak/>
+        <w:t>Remove dev dependencies.</w:t>
+      </w:r>
+    </w:p>
+    <w:p>
+      <w:pPr>
+        <w:numPr>
+          <w:ilvl w:val="1"/>
+          <w:numId w:val="50"/>
+        </w:numPr>
+      </w:pPr>
+      <w:r>
+        <w:t>Enable minification.</w:t>
+      </w:r>
+    </w:p>
+    <w:p>
+      <w:pPr>
+        <w:numPr>
+          <w:ilvl w:val="1"/>
+          <w:numId w:val="50"/>
+        </w:numPr>
+      </w:pPr>
+      <w:r>
+        <w:t>Remove source maps.</w:t>
+      </w:r>
+    </w:p>
+    <w:p>
+      <w:pPr>
+        <w:numPr>
+          <w:ilvl w:val="0"/>
+          <w:numId w:val="50"/>
+        </w:numPr>
+      </w:pPr>
+      <w:r>
+        <w:t>Configure Tauri production settings.</w:t>
+      </w:r>
+    </w:p>
+    <w:p>
+      <w:pPr>
+        <w:numPr>
+          <w:ilvl w:val="1"/>
+          <w:numId w:val="50"/>
+        </w:numPr>
+      </w:pPr>
+      <w:r>
+        <w:t>Disable dev server.</w:t>
+      </w:r>
+    </w:p>
+    <w:p>
+      <w:pPr>
+        <w:numPr>
+          <w:ilvl w:val="1"/>
+          <w:numId w:val="50"/>
+        </w:numPr>
+      </w:pPr>
+      <w:r>
+        <w:t>Enable optimized Rust build (release profile).</w:t>
+      </w:r>
+    </w:p>
+    <w:p>
+      <w:pPr>
+        <w:numPr>
+          <w:ilvl w:val="1"/>
+          <w:numId w:val="50"/>
+        </w:numPr>
+      </w:pPr>
+      <w:r>
+        <w:t>Enable LTO (link time optimization).</w:t>
+      </w:r>
+    </w:p>
+    <w:p>
+      <w:pPr>
+        <w:numPr>
+          <w:ilvl w:val="1"/>
+          <w:numId w:val="50"/>
+        </w:numPr>
+      </w:pPr>
+      <w:r>
+        <w:t>Strip debug symbols.</w:t>
+      </w:r>
+    </w:p>
+    <w:p>
+      <w:pPr>
+        <w:numPr>
+          <w:ilvl w:val="0"/>
+          <w:numId w:val="50"/>
+        </w:numPr>
+      </w:pPr>
+      <w:r>
+        <w:t>Reduce binary size.</w:t>
+      </w:r>
+    </w:p>
+    <w:p>
+      <w:pPr>
+        <w:numPr>
+          <w:ilvl w:val="1"/>
+          <w:numId w:val="50"/>
+        </w:numPr>
+      </w:pPr>
+      <w:r>
+        <w:t>Enable Rust opt-level = "z" or "s".</w:t>
+      </w:r>
+    </w:p>
+    <w:p>
+      <w:pPr>
+        <w:numPr>
+          <w:ilvl w:val="1"/>
+          <w:numId w:val="50"/>
+        </w:numPr>
+      </w:pPr>
+      <w:r>
+        <w:t>Enable strip = true.</w:t>
+      </w:r>
+    </w:p>
+    <w:p>
+      <w:pPr>
+        <w:numPr>
+          <w:ilvl w:val="1"/>
+          <w:numId w:val="50"/>
+        </w:numPr>
+      </w:pPr>
+      <w:r>
+        <w:t>Remove unused Tauri features.</w:t>
+      </w:r>
+    </w:p>
+    <w:p>
+      <w:pPr>
+        <w:numPr>
+          <w:ilvl w:val="1"/>
+          <w:numId w:val="50"/>
+        </w:numPr>
+      </w:pPr>
+      <w:r>
+        <w:t xml:space="preserve">Disable unused APIs in </w:t>
+      </w:r>
+      <w:proofErr w:type="spellStart"/>
+      <w:r>
+        <w:t>tauri.</w:t>
+      </w:r>
+      <w:proofErr w:type="gramStart"/>
+      <w:r>
+        <w:t>conf.json</w:t>
+      </w:r>
+      <w:proofErr w:type="spellEnd"/>
+      <w:proofErr w:type="gramEnd"/>
+      <w:r>
+        <w:t>.</w:t>
+      </w:r>
+    </w:p>
+    <w:p>
+      <w:pPr>
+        <w:numPr>
+          <w:ilvl w:val="0"/>
+          <w:numId w:val="50"/>
+        </w:numPr>
+      </w:pPr>
+      <w:r>
+        <w:t>Security hardening.</w:t>
+      </w:r>
+    </w:p>
+    <w:p>
+      <w:pPr>
+        <w:numPr>
+          <w:ilvl w:val="1"/>
+          <w:numId w:val="50"/>
+        </w:numPr>
+      </w:pPr>
+      <w:r>
+        <w:t>Disable shell access unless required.</w:t>
+      </w:r>
+    </w:p>
+    <w:p>
+      <w:pPr>
+        <w:numPr>
+          <w:ilvl w:val="1"/>
+          <w:numId w:val="50"/>
+        </w:numPr>
+      </w:pPr>
+      <w:r>
+        <w:t>Restrict filesystem scope.</w:t>
+      </w:r>
+    </w:p>
+    <w:p>
+      <w:pPr>
+        <w:numPr>
+          <w:ilvl w:val="1"/>
+          <w:numId w:val="50"/>
+        </w:numPr>
+      </w:pPr>
+      <w:r>
+        <w:t>Allow only required Tauri permissions.</w:t>
+      </w:r>
+    </w:p>
+    <w:p>
+      <w:pPr>
+        <w:numPr>
+          <w:ilvl w:val="1"/>
+          <w:numId w:val="50"/>
+        </w:numPr>
+      </w:pPr>
+      <w:r>
+        <w:t>Disable remote URLs.</w:t>
+      </w:r>
+    </w:p>
+    <w:p>
+      <w:pPr>
+        <w:numPr>
+          <w:ilvl w:val="1"/>
+          <w:numId w:val="50"/>
+        </w:numPr>
+      </w:pPr>
+      <w:r>
+        <w:t>Enforce local assets only.</w:t>
+      </w:r>
+    </w:p>
+    <w:p>
+      <w:pPr>
+        <w:numPr>
+          <w:ilvl w:val="0"/>
+          <w:numId w:val="50"/>
+        </w:numPr>
+      </w:pPr>
+      <w:r>
+        <w:t>Tauri capability restrictions.</w:t>
+      </w:r>
+      <w:r>
+        <w:br/>
+        <w:t>Only allow:</w:t>
+      </w:r>
+    </w:p>
+    <w:p>
+      <w:pPr>
+        <w:numPr>
+          <w:ilvl w:val="1"/>
+          <w:numId w:val="50"/>
+        </w:numPr>
+      </w:pPr>
+      <w:r>
+        <w:t>file read</w:t>
+      </w:r>
+    </w:p>
+    <w:p>
+      <w:pPr>
+        <w:numPr>
+          <w:ilvl w:val="1"/>
+          <w:numId w:val="50"/>
+        </w:numPr>
+      </w:pPr>
+      <w:r>
+        <w:t xml:space="preserve">file </w:t>
+      </w:r>
+      <w:proofErr w:type="gramStart"/>
+      <w:r>
+        <w:t>write</w:t>
+      </w:r>
+      <w:proofErr w:type="gramEnd"/>
+    </w:p>
+    <w:p>
+      <w:pPr>
+        <w:numPr>
+          <w:ilvl w:val="1"/>
+          <w:numId w:val="50"/>
+        </w:numPr>
+      </w:pPr>
+      <w:r>
+        <w:t>directory read</w:t>
+      </w:r>
+    </w:p>
+    <w:p>
+      <w:pPr>
+        <w:numPr>
+          <w:ilvl w:val="1"/>
+          <w:numId w:val="50"/>
+        </w:numPr>
+      </w:pPr>
+      <w:r>
+        <w:t xml:space="preserve">directory </w:t>
+      </w:r>
+      <w:proofErr w:type="gramStart"/>
+      <w:r>
+        <w:t>write</w:t>
+      </w:r>
+      <w:proofErr w:type="gramEnd"/>
+    </w:p>
+    <w:p>
+      <w:r>
+        <w:t>Deny:</w:t>
+      </w:r>
+    </w:p>
+    <w:p>
+      <w:pPr>
+        <w:numPr>
+          <w:ilvl w:val="1"/>
+          <w:numId w:val="50"/>
+        </w:numPr>
+      </w:pPr>
+      <w:r>
+        <w:t>arbitrary command execution</w:t>
+      </w:r>
+    </w:p>
+    <w:p>
+      <w:pPr>
+        <w:numPr>
+          <w:ilvl w:val="1"/>
+          <w:numId w:val="50"/>
+        </w:numPr>
+      </w:pPr>
+      <w:r>
+        <w:t>external process spawning</w:t>
+      </w:r>
+    </w:p>
+    <w:p>
+      <w:pPr>
+        <w:numPr>
+          <w:ilvl w:val="1"/>
+          <w:numId w:val="50"/>
+        </w:numPr>
+      </w:pPr>
+      <w:r>
+        <w:t>network access unless needed</w:t>
+      </w:r>
+    </w:p>
+    <w:p>
+      <w:pPr>
+        <w:numPr>
+          <w:ilvl w:val="0"/>
+          <w:numId w:val="50"/>
+        </w:numPr>
+      </w:pPr>
+      <w:r>
+        <w:t>Content Security Policy.</w:t>
+      </w:r>
+      <w:r>
+        <w:br/>
+        <w:t>Configure strict CSP:</w:t>
+      </w:r>
+    </w:p>
+    <w:p>
+      <w:r>
+        <w:t>Allow:</w:t>
+      </w:r>
+      <w:r>
+        <w:br/>
+      </w:r>
+      <w:proofErr w:type="spellStart"/>
+      <w:r>
+        <w:t>self assets</w:t>
+      </w:r>
+      <w:proofErr w:type="spellEnd"/>
+    </w:p>
+    <w:p>
+      <w:r>
+        <w:t>Block:</w:t>
+      </w:r>
+      <w:r>
+        <w:br/>
+        <w:t>inline scripts</w:t>
+      </w:r>
+      <w:r>
+        <w:br/>
+      </w:r>
+      <w:r>
+        <w:lastRenderedPageBreak/>
+        <w:t>external scripts</w:t>
+      </w:r>
+      <w:r>
+        <w:br/>
+        <w:t>eval execution</w:t>
+      </w:r>
+    </w:p>
+    <w:p>
+      <w:pPr>
+        <w:numPr>
+          <w:ilvl w:val="0"/>
+          <w:numId w:val="50"/>
+        </w:numPr>
+      </w:pPr>
+      <w:r>
+        <w:t>Secure IPC commands.</w:t>
+      </w:r>
+      <w:r>
+        <w:br/>
+        <w:t>Validate all inputs:</w:t>
+      </w:r>
+    </w:p>
+    <w:p>
+      <w:pPr>
+        <w:numPr>
+          <w:ilvl w:val="1"/>
+          <w:numId w:val="50"/>
+        </w:numPr>
+      </w:pPr>
+      <w:r>
+        <w:t>folder paths must exist</w:t>
+      </w:r>
+    </w:p>
+    <w:p>
+      <w:pPr>
+        <w:numPr>
+          <w:ilvl w:val="1"/>
+          <w:numId w:val="50"/>
+        </w:numPr>
+      </w:pPr>
+      <w:r>
+        <w:t>paths must be absolute</w:t>
+      </w:r>
+    </w:p>
+    <w:p>
+      <w:pPr>
+        <w:numPr>
+          <w:ilvl w:val="1"/>
+          <w:numId w:val="50"/>
+        </w:numPr>
+      </w:pPr>
+      <w:r>
+        <w:t xml:space="preserve">prevent path traversal </w:t>
+      </w:r>
+      <w:proofErr w:type="gramStart"/>
+      <w:r>
+        <w:t>(..</w:t>
+      </w:r>
+      <w:proofErr w:type="gramEnd"/>
+      <w:r>
+        <w:t>/)</w:t>
+      </w:r>
+    </w:p>
+    <w:p>
+      <w:pPr>
+        <w:numPr>
+          <w:ilvl w:val="1"/>
+          <w:numId w:val="50"/>
+        </w:numPr>
+      </w:pPr>
+      <w:r>
+        <w:t>validate rule JSON schema</w:t>
+      </w:r>
+    </w:p>
+    <w:p>
+      <w:pPr>
+        <w:numPr>
+          <w:ilvl w:val="0"/>
+          <w:numId w:val="50"/>
+        </w:numPr>
+      </w:pPr>
+      <w:r>
+        <w:t>File operation protections.</w:t>
+      </w:r>
+      <w:r>
+        <w:br/>
+        <w:t>Add checks:</w:t>
+      </w:r>
+    </w:p>
+    <w:p>
+      <w:r>
+        <w:t>Prevent operations on:</w:t>
+      </w:r>
+      <w:r>
+        <w:br/>
+        <w:t>Windows directory</w:t>
+      </w:r>
+      <w:r>
+        <w:br/>
+        <w:t>Program Files</w:t>
+      </w:r>
+      <w:r>
+        <w:br/>
+      </w:r>
+      <w:proofErr w:type="spellStart"/>
+      <w:r>
+        <w:t>AppData</w:t>
+      </w:r>
+      <w:proofErr w:type="spellEnd"/>
+      <w:r>
+        <w:t xml:space="preserve"> system areas</w:t>
+      </w:r>
+    </w:p>
+    <w:p>
+      <w:r>
+        <w:t>Add max file operation limit per run.</w:t>
+      </w:r>
+    </w:p>
+    <w:p>
+      <w:pPr>
+        <w:numPr>
+          <w:ilvl w:val="0"/>
+          <w:numId w:val="50"/>
+        </w:numPr>
+      </w:pPr>
+      <w:r>
+        <w:t>Error protection.</w:t>
+      </w:r>
+      <w:r>
+        <w:br/>
+        <w:t>Add fail safe:</w:t>
+      </w:r>
+    </w:p>
+    <w:p>
+      <w:r>
+        <w:t>If error rate &gt; threshold:</w:t>
+      </w:r>
+      <w:r>
+        <w:br/>
+        <w:t>stop execution.</w:t>
+      </w:r>
+    </w:p>
+    <w:p>
+      <w:pPr>
+        <w:numPr>
+          <w:ilvl w:val="0"/>
+          <w:numId w:val="50"/>
+        </w:numPr>
+      </w:pPr>
+      <w:r>
+        <w:t>Logging controls.</w:t>
+      </w:r>
+      <w:r>
+        <w:br/>
+        <w:t>Disable verbose logs in production.</w:t>
+      </w:r>
+      <w:r>
+        <w:br/>
+        <w:t>Store only necessary history.</w:t>
+      </w:r>
+    </w:p>
+    <w:p>
+      <w:pPr>
+        <w:numPr>
+          <w:ilvl w:val="0"/>
+          <w:numId w:val="50"/>
+        </w:numPr>
+      </w:pPr>
+      <w:r>
+        <w:t>Installer configuration.</w:t>
+      </w:r>
+      <w:r>
+        <w:br/>
+        <w:t>Configure Tauri bundle:</w:t>
+      </w:r>
+    </w:p>
+    <w:p>
+      <w:r>
+        <w:t>Windows targets:</w:t>
+      </w:r>
+      <w:r>
+        <w:br/>
+        <w:t>MSI</w:t>
+      </w:r>
+      <w:r>
+        <w:br/>
+        <w:t>EXE installer</w:t>
+      </w:r>
+    </w:p>
+    <w:p>
+      <w:r>
+        <w:t>Configure:</w:t>
+      </w:r>
+      <w:r>
+        <w:br/>
+        <w:t>app icon</w:t>
+      </w:r>
+      <w:r>
+        <w:br/>
+        <w:t>version</w:t>
+      </w:r>
+      <w:r>
+        <w:br/>
+        <w:t>publisher</w:t>
+      </w:r>
+      <w:r>
+        <w:br/>
+        <w:t>description</w:t>
+      </w:r>
+    </w:p>
+    <w:p>
+      <w:pPr>
+        <w:numPr>
+          <w:ilvl w:val="0"/>
+          <w:numId w:val="51"/>
+        </w:numPr>
+      </w:pPr>
+      <w:r>
+        <w:t>Code signing preparation (optional but correct practice).</w:t>
+      </w:r>
+      <w:r>
+        <w:br/>
+        <w:t>Prepare signing config if certificate exists.</w:t>
+      </w:r>
+      <w:r>
+        <w:br/>
+        <w:t>Prevent SmartScreen warnings.</w:t>
+      </w:r>
+    </w:p>
+    <w:p>
+      <w:pPr>
+        <w:numPr>
+          <w:ilvl w:val="0"/>
+          <w:numId w:val="51"/>
+        </w:numPr>
+      </w:pPr>
+      <w:r>
+        <w:t>App versioning.</w:t>
+      </w:r>
+      <w:r>
+        <w:br/>
+        <w:t>Implement semantic version:</w:t>
+      </w:r>
+    </w:p>
+    <w:p>
+      <w:proofErr w:type="spellStart"/>
+      <w:proofErr w:type="gramStart"/>
+      <w:r>
+        <w:t>major.minor</w:t>
+      </w:r>
+      <w:proofErr w:type="gramEnd"/>
+      <w:r>
+        <w:t>.patch</w:t>
+      </w:r>
+      <w:proofErr w:type="spellEnd"/>
+    </w:p>
+    <w:p>
+      <w:r>
+        <w:t>Store in:</w:t>
+      </w:r>
+      <w:r>
+        <w:br/>
+      </w:r>
+      <w:proofErr w:type="spellStart"/>
+      <w:proofErr w:type="gramStart"/>
+      <w:r>
+        <w:t>package.json</w:t>
+      </w:r>
+      <w:proofErr w:type="spellEnd"/>
+      <w:proofErr w:type="gramEnd"/>
+      <w:r>
+        <w:br/>
+      </w:r>
+      <w:proofErr w:type="spellStart"/>
+      <w:r>
+        <w:t>tauri.</w:t>
+      </w:r>
+      <w:proofErr w:type="gramStart"/>
+      <w:r>
+        <w:t>conf.json</w:t>
+      </w:r>
+      <w:proofErr w:type="spellEnd"/>
+      <w:proofErr w:type="gramEnd"/>
+    </w:p>
+    <w:p>
+      <w:pPr>
+        <w:numPr>
+          <w:ilvl w:val="0"/>
+          <w:numId w:val="52"/>
+        </w:numPr>
+      </w:pPr>
+      <w:r>
+        <w:lastRenderedPageBreak/>
+        <w:t>Production testing.</w:t>
+      </w:r>
+      <w:r>
+        <w:br/>
+        <w:t>Test:</w:t>
+      </w:r>
+    </w:p>
+    <w:p>
+      <w:r>
+        <w:t>clean Windows machine</w:t>
+      </w:r>
+      <w:r>
+        <w:br/>
+        <w:t>large folder test</w:t>
+      </w:r>
+      <w:r>
+        <w:br/>
+        <w:t>undo after restart</w:t>
+      </w:r>
+      <w:r>
+        <w:br/>
+        <w:t>permission failures</w:t>
+      </w:r>
+      <w:r>
+        <w:br/>
+        <w:t>conflict rename behavior</w:t>
+      </w:r>
+    </w:p>
+    <w:p>
+      <w:pPr>
+        <w:numPr>
+          <w:ilvl w:val="0"/>
+          <w:numId w:val="53"/>
+        </w:numPr>
+      </w:pPr>
+      <w:r>
+        <w:t>Performance validation.</w:t>
+      </w:r>
+      <w:r>
+        <w:br/>
+        <w:t>Test with:</w:t>
+      </w:r>
+    </w:p>
+    <w:p>
+      <w:r>
+        <w:t>10k files</w:t>
+      </w:r>
+      <w:r>
+        <w:br/>
+        <w:t>50k files</w:t>
+      </w:r>
+      <w:r>
+        <w:br/>
+        <w:t>100k files</w:t>
+      </w:r>
+    </w:p>
+    <w:p>
+      <w:r>
+        <w:t>Measure:</w:t>
+      </w:r>
+      <w:r>
+        <w:br/>
+        <w:t>scan time</w:t>
+      </w:r>
+      <w:r>
+        <w:br/>
+        <w:t>execution time</w:t>
+      </w:r>
+      <w:r>
+        <w:br/>
+        <w:t>memory usage</w:t>
+      </w:r>
+    </w:p>
+    <w:p>
+      <w:pPr>
+        <w:numPr>
+          <w:ilvl w:val="0"/>
+          <w:numId w:val="54"/>
+        </w:numPr>
+      </w:pPr>
+      <w:r>
+        <w:t>Build pipeline.</w:t>
+      </w:r>
+      <w:r>
+        <w:br/>
+        <w:t>Final build steps:</w:t>
+      </w:r>
+    </w:p>
+    <w:p>
+      <w:proofErr w:type="spellStart"/>
+      <w:r>
+        <w:t>npm</w:t>
+      </w:r>
+      <w:proofErr w:type="spellEnd"/>
+      <w:r>
+        <w:t xml:space="preserve"> run build</w:t>
+      </w:r>
+      <w:r>
+        <w:br/>
+      </w:r>
+      <w:proofErr w:type="spellStart"/>
+      <w:r>
+        <w:t>npm</w:t>
+      </w:r>
+      <w:proofErr w:type="spellEnd"/>
+      <w:r>
+        <w:t xml:space="preserve"> run </w:t>
+      </w:r>
+      <w:proofErr w:type="spellStart"/>
+      <w:proofErr w:type="gramStart"/>
+      <w:r>
+        <w:t>tauri:build</w:t>
+      </w:r>
+      <w:proofErr w:type="spellEnd"/>
+      <w:proofErr w:type="gramEnd"/>
+    </w:p>
+    <w:p>
+      <w:pPr>
+        <w:numPr>
+          <w:ilvl w:val="0"/>
+          <w:numId w:val="55"/>
+        </w:numPr>
+      </w:pPr>
+      <w:r>
+        <w:t>Release checklist.</w:t>
+      </w:r>
+      <w:r>
+        <w:br/>
+        <w:t>Verify:</w:t>
+      </w:r>
+    </w:p>
+    <w:p>
+      <w:r>
+        <w:t>executable launches</w:t>
+      </w:r>
+      <w:r>
+        <w:br/>
+        <w:t>no console window</w:t>
+      </w:r>
+      <w:r>
+        <w:br/>
+        <w:t>icons correct</w:t>
+      </w:r>
+      <w:r>
+        <w:br/>
+        <w:t>no dev tools</w:t>
+      </w:r>
+      <w:r>
+        <w:br/>
+        <w:t>history persists</w:t>
+      </w:r>
+      <w:r>
+        <w:br/>
+        <w:t>undo works</w:t>
+      </w:r>
+      <w:r>
+        <w:br/>
+        <w:t>rules load correctly</w:t>
+      </w:r>
+    </w:p>
+    <w:p>
+      <w:pPr>
+        <w:pStyle w:val="Heading3"/>
+      </w:pPr>
+      <w:r>
+        <w:t>Deliverables</w:t>
+      </w:r>
+    </w:p>
+    <w:p>
+      <w:pPr>
+        <w:numPr>
+          <w:ilvl w:val="0"/>
+          <w:numId w:val="56"/>
+        </w:numPr>
+      </w:pPr>
+      <w:r>
+        <w:t>Production optimized EXE file.</w:t>
+      </w:r>
+    </w:p>
+    <w:p>
+      <w:pPr>
+        <w:numPr>
+          <w:ilvl w:val="0"/>
+          <w:numId w:val="56"/>
+        </w:numPr>
+      </w:pPr>
+      <w:r>
+        <w:t>Secure Tauri configuration.</w:t>
+      </w:r>
+    </w:p>
+    <w:p>
+      <w:pPr>
+        <w:numPr>
+          <w:ilvl w:val="0"/>
+          <w:numId w:val="56"/>
+        </w:numPr>
+      </w:pPr>
+      <w:r>
+        <w:t>Reduced binary size build.</w:t>
+      </w:r>
+    </w:p>
+    <w:p>
+      <w:pPr>
+        <w:numPr>
+          <w:ilvl w:val="0"/>
+          <w:numId w:val="56"/>
+        </w:numPr>
+      </w:pPr>
+      <w:r>
+        <w:t>Hardened IPC command layer.</w:t>
+      </w:r>
+    </w:p>
+    <w:p>
+      <w:pPr>
+        <w:numPr>
+          <w:ilvl w:val="0"/>
+          <w:numId w:val="56"/>
+        </w:numPr>
+      </w:pPr>
+      <w:r>
+        <w:t>Release test checklist.</w:t>
+      </w:r>
+    </w:p>
+    <w:p>
+      <w:pPr>
+        <w:pStyle w:val="Heading3"/>
+      </w:pPr>
+      <w:r>
+        <w:t>Pages Implemented</w:t>
+      </w:r>
+    </w:p>
+    <w:p>
+      <w:r>
+        <w:t>None</w:t>
+      </w:r>
+    </w:p>
+    <w:p/>
     <w:p/>
     <w:sectPr>
       <w:pgSz w:w="12240" w:h="15840"/>
@@ -3428,6 +4397,232 @@
 <file path=word/numbering.xml><?xml version="1.0" encoding="utf-8"?>
 <w:numbering xmlns:wpc="http://schemas.microsoft.com/office/word/2010/wordprocessingCanvas" xmlns:cx="http://schemas.microsoft.com/office/drawing/2014/chartex" xmlns:cx1="http://schemas.microsoft.com/office/drawing/2015/9/8/chartex" xmlns:cx2="http://schemas.microsoft.com/office/drawing/2015/10/21/chartex" xmlns:cx3="http://schemas.microsoft.com/office/drawing/2016/5/9/chartex" xmlns:cx4="http://schemas.microsoft.com/office/drawing/2016/5/10/chartex" xmlns:cx5="http://schemas.microsoft.com/office/drawing/2016/5/11/chartex" xmlns:cx6="http://schemas.microsoft.com/office/drawing/2016/5/12/chartex" xmlns:cx7="http://schemas.microsoft.com/office/drawing/2016/5/13/chartex" xmlns:cx8="http://schemas.microsoft.com/office/drawing/2016/5/14/chartex" xmlns:mc="http://schemas.openxmlformats.org/markup-compatibility/2006" xmlns:aink="http://schemas.microsoft.com/office/drawing/2016/ink" xmlns:am3d="http://schemas.microsoft.com/office/drawing/2017/model3d" xmlns:o="urn:schemas-microsoft-com:office:office" xmlns:oel="http://schemas.microsoft.com/office/2019/extlst" xmlns:r="http://schemas.openxmlformats.org/officeDocument/2006/relationships" xmlns:m="http://schemas.openxmlformats.org/officeDocument/2006/math" xmlns:v="urn:schemas-microsoft-com:vml" xmlns:wp14="http://schemas.microsoft.com/office/word/2010/wordprocessingDrawing" xmlns:wp="http://schemas.openxmlformats.org/drawingml/2006/wordprocessingDrawing" xmlns:w10="urn:schemas-microsoft-com:office:word" xmlns:w="http://schemas.openxmlformats.org/wordprocessingml/2006/main" xmlns:w14="http://schemas.microsoft.com/office/word/2010/wordml" xmlns:w15="http://schemas.microsoft.com/office/word/2012/wordml" xmlns:w16cex="http://schemas.microsoft.com/office/word/2018/wordml/cex" xmlns:w16cid="http://schemas.microsoft.com/office/word/2016/wordml/cid" xmlns:w16="http://schemas.microsoft.com/office/word/2018/wordml" xmlns:w16du="http://schemas.microsoft.com/office/word/2023/wordml/word16du" xmlns:w16sdtdh="http://schemas.microsoft.com/office/word/2020/wordml/sdtdatahash" xmlns:w16sdtfl="http://schemas.microsoft.com/office/word/2024/wordml/sdtformatlock" xmlns:w16se="http://schemas.microsoft.com/office/word/2015/wordml/symex" xmlns:wpg="http://schemas.microsoft.com/office/word/2010/wordprocessingGroup" xmlns:wpi="http://schemas.microsoft.com/office/word/2010/wordprocessingInk" xmlns:wne="http://schemas.microsoft.com/office/word/2006/wordml" xmlns:wps="http://schemas.microsoft.com/office/word/2010/wordprocessingShape" mc:Ignorable="w14 w15 w16se w16cid w16 w16cex w16sdtdh w16sdtfl w16du wp14">
   <w:abstractNum w:abstractNumId="0" w15:restartNumberingAfterBreak="0">
+    <w:nsid w:val="01F41FE7"/>
+    <w:multiLevelType w:val="multilevel"/>
+    <w:tmpl w:val="3F9481BE"/>
+    <w:lvl w:ilvl="0">
+      <w:start w:val="1"/>
+      <w:numFmt w:val="decimal"/>
+      <w:lvlText w:val="%1."/>
+      <w:lvlJc w:val="left"/>
+      <w:pPr>
+        <w:tabs>
+          <w:tab w:val="num" w:pos="360"/>
+        </w:tabs>
+        <w:ind w:left="360" w:hanging="360"/>
+      </w:pPr>
+    </w:lvl>
+    <w:lvl w:ilvl="1">
+      <w:start w:val="1"/>
+      <w:numFmt w:val="bullet"/>
+      <w:lvlText w:val=""/>
+      <w:lvlJc w:val="left"/>
+      <w:pPr>
+        <w:ind w:left="1080" w:hanging="360"/>
+      </w:pPr>
+      <w:rPr>
+        <w:rFonts w:ascii="Symbol" w:hAnsi="Symbol" w:hint="default"/>
+      </w:rPr>
+    </w:lvl>
+    <w:lvl w:ilvl="2" w:tentative="1">
+      <w:start w:val="1"/>
+      <w:numFmt w:val="decimal"/>
+      <w:lvlText w:val="%3."/>
+      <w:lvlJc w:val="left"/>
+      <w:pPr>
+        <w:tabs>
+          <w:tab w:val="num" w:pos="1800"/>
+        </w:tabs>
+        <w:ind w:left="1800" w:hanging="360"/>
+      </w:pPr>
+    </w:lvl>
+    <w:lvl w:ilvl="3" w:tentative="1">
+      <w:start w:val="1"/>
+      <w:numFmt w:val="decimal"/>
+      <w:lvlText w:val="%4."/>
+      <w:lvlJc w:val="left"/>
+      <w:pPr>
+        <w:tabs>
+          <w:tab w:val="num" w:pos="2520"/>
+        </w:tabs>
+        <w:ind w:left="2520" w:hanging="360"/>
+      </w:pPr>
+    </w:lvl>
+    <w:lvl w:ilvl="4" w:tentative="1">
+      <w:start w:val="1"/>
+      <w:numFmt w:val="decimal"/>
+      <w:lvlText w:val="%5."/>
+      <w:lvlJc w:val="left"/>
+      <w:pPr>
+        <w:tabs>
+          <w:tab w:val="num" w:pos="3240"/>
+        </w:tabs>
+        <w:ind w:left="3240" w:hanging="360"/>
+      </w:pPr>
+    </w:lvl>
+    <w:lvl w:ilvl="5" w:tentative="1">
+      <w:start w:val="1"/>
+      <w:numFmt w:val="decimal"/>
+      <w:lvlText w:val="%6."/>
+      <w:lvlJc w:val="left"/>
+      <w:pPr>
+        <w:tabs>
+          <w:tab w:val="num" w:pos="3960"/>
+        </w:tabs>
+        <w:ind w:left="3960" w:hanging="360"/>
+      </w:pPr>
+    </w:lvl>
+    <w:lvl w:ilvl="6" w:tentative="1">
+      <w:start w:val="1"/>
+      <w:numFmt w:val="decimal"/>
+      <w:lvlText w:val="%7."/>
+      <w:lvlJc w:val="left"/>
+      <w:pPr>
+        <w:tabs>
+          <w:tab w:val="num" w:pos="4680"/>
+        </w:tabs>
+        <w:ind w:left="4680" w:hanging="360"/>
+      </w:pPr>
+    </w:lvl>
+    <w:lvl w:ilvl="7" w:tentative="1">
+      <w:start w:val="1"/>
+      <w:numFmt w:val="decimal"/>
+      <w:lvlText w:val="%8."/>
+      <w:lvlJc w:val="left"/>
+      <w:pPr>
+        <w:tabs>
+          <w:tab w:val="num" w:pos="5400"/>
+        </w:tabs>
+        <w:ind w:left="5400" w:hanging="360"/>
+      </w:pPr>
+    </w:lvl>
+    <w:lvl w:ilvl="8" w:tentative="1">
+      <w:start w:val="1"/>
+      <w:numFmt w:val="decimal"/>
+      <w:lvlText w:val="%9."/>
+      <w:lvlJc w:val="left"/>
+      <w:pPr>
+        <w:tabs>
+          <w:tab w:val="num" w:pos="6120"/>
+        </w:tabs>
+        <w:ind w:left="6120" w:hanging="360"/>
+      </w:pPr>
+    </w:lvl>
+  </w:abstractNum>
+  <w:abstractNum w:abstractNumId="1" w15:restartNumberingAfterBreak="0">
+    <w:nsid w:val="03BC74B3"/>
+    <w:multiLevelType w:val="multilevel"/>
+    <w:tmpl w:val="A5B6D130"/>
+    <w:lvl w:ilvl="0">
+      <w:start w:val="16"/>
+      <w:numFmt w:val="decimal"/>
+      <w:lvlText w:val="%1."/>
+      <w:lvlJc w:val="left"/>
+      <w:pPr>
+        <w:tabs>
+          <w:tab w:val="num" w:pos="720"/>
+        </w:tabs>
+        <w:ind w:left="720" w:hanging="360"/>
+      </w:pPr>
+    </w:lvl>
+    <w:lvl w:ilvl="1" w:tentative="1">
+      <w:start w:val="1"/>
+      <w:numFmt w:val="decimal"/>
+      <w:lvlText w:val="%2."/>
+      <w:lvlJc w:val="left"/>
+      <w:pPr>
+        <w:tabs>
+          <w:tab w:val="num" w:pos="1440"/>
+        </w:tabs>
+        <w:ind w:left="1440" w:hanging="360"/>
+      </w:pPr>
+    </w:lvl>
+    <w:lvl w:ilvl="2" w:tentative="1">
+      <w:start w:val="1"/>
+      <w:numFmt w:val="decimal"/>
+      <w:lvlText w:val="%3."/>
+      <w:lvlJc w:val="left"/>
+      <w:pPr>
+        <w:tabs>
+          <w:tab w:val="num" w:pos="2160"/>
+        </w:tabs>
+        <w:ind w:left="2160" w:hanging="360"/>
+      </w:pPr>
+    </w:lvl>
+    <w:lvl w:ilvl="3" w:tentative="1">
+      <w:start w:val="1"/>
+      <w:numFmt w:val="decimal"/>
+      <w:lvlText w:val="%4."/>
+      <w:lvlJc w:val="left"/>
+      <w:pPr>
+        <w:tabs>
+          <w:tab w:val="num" w:pos="2880"/>
+        </w:tabs>
+        <w:ind w:left="2880" w:hanging="360"/>
+      </w:pPr>
+    </w:lvl>
+    <w:lvl w:ilvl="4" w:tentative="1">
+      <w:start w:val="1"/>
+      <w:numFmt w:val="decimal"/>
+      <w:lvlText w:val="%5."/>
+      <w:lvlJc w:val="left"/>
+      <w:pPr>
+        <w:tabs>
+          <w:tab w:val="num" w:pos="3600"/>
+        </w:tabs>
+        <w:ind w:left="3600" w:hanging="360"/>
+      </w:pPr>
+    </w:lvl>
+    <w:lvl w:ilvl="5" w:tentative="1">
+      <w:start w:val="1"/>
+      <w:numFmt w:val="decimal"/>
+      <w:lvlText w:val="%6."/>
+      <w:lvlJc w:val="left"/>
+      <w:pPr>
+        <w:tabs>
+          <w:tab w:val="num" w:pos="4320"/>
+        </w:tabs>
+        <w:ind w:left="4320" w:hanging="360"/>
+      </w:pPr>
+    </w:lvl>
+    <w:lvl w:ilvl="6" w:tentative="1">
+      <w:start w:val="1"/>
+      <w:numFmt w:val="decimal"/>
+      <w:lvlText w:val="%7."/>
+      <w:lvlJc w:val="left"/>
+      <w:pPr>
+        <w:tabs>
+          <w:tab w:val="num" w:pos="5040"/>
+        </w:tabs>
+        <w:ind w:left="5040" w:hanging="360"/>
+      </w:pPr>
+    </w:lvl>
+    <w:lvl w:ilvl="7" w:tentative="1">
+      <w:start w:val="1"/>
+      <w:numFmt w:val="decimal"/>
+      <w:lvlText w:val="%8."/>
+      <w:lvlJc w:val="left"/>
+      <w:pPr>
+        <w:tabs>
+          <w:tab w:val="num" w:pos="5760"/>
+        </w:tabs>
+        <w:ind w:left="5760" w:hanging="360"/>
+      </w:pPr>
+    </w:lvl>
+    <w:lvl w:ilvl="8" w:tentative="1">
+      <w:start w:val="1"/>
+      <w:numFmt w:val="decimal"/>
+      <w:lvlText w:val="%9."/>
+      <w:lvlJc w:val="left"/>
+      <w:pPr>
+        <w:tabs>
+          <w:tab w:val="num" w:pos="6480"/>
+        </w:tabs>
+        <w:ind w:left="6480" w:hanging="360"/>
+      </w:pPr>
+    </w:lvl>
+  </w:abstractNum>
+  <w:abstractNum w:abstractNumId="2" w15:restartNumberingAfterBreak="0">
     <w:nsid w:val="09FF36D2"/>
     <w:multiLevelType w:val="multilevel"/>
     <w:tmpl w:val="CD92E9F4"/>
@@ -3540,7 +4735,7 @@
       </w:pPr>
     </w:lvl>
   </w:abstractNum>
-  <w:abstractNum w:abstractNumId="1" w15:restartNumberingAfterBreak="0">
+  <w:abstractNum w:abstractNumId="3" w15:restartNumberingAfterBreak="0">
     <w:nsid w:val="0ECD71E0"/>
     <w:multiLevelType w:val="multilevel"/>
     <w:tmpl w:val="D340E8AA"/>
@@ -3653,7 +4848,7 @@
       </w:pPr>
     </w:lvl>
   </w:abstractNum>
-  <w:abstractNum w:abstractNumId="2" w15:restartNumberingAfterBreak="0">
+  <w:abstractNum w:abstractNumId="4" w15:restartNumberingAfterBreak="0">
     <w:nsid w:val="0F200073"/>
     <w:multiLevelType w:val="multilevel"/>
     <w:tmpl w:val="B08EE5FA"/>
@@ -3766,7 +4961,7 @@
       </w:pPr>
     </w:lvl>
   </w:abstractNum>
-  <w:abstractNum w:abstractNumId="3" w15:restartNumberingAfterBreak="0">
+  <w:abstractNum w:abstractNumId="5" w15:restartNumberingAfterBreak="0">
     <w:nsid w:val="117C7367"/>
     <w:multiLevelType w:val="hybridMultilevel"/>
     <w:tmpl w:val="2340986C"/>
@@ -3855,7 +5050,7 @@
       </w:pPr>
     </w:lvl>
   </w:abstractNum>
-  <w:abstractNum w:abstractNumId="4" w15:restartNumberingAfterBreak="0">
+  <w:abstractNum w:abstractNumId="6" w15:restartNumberingAfterBreak="0">
     <w:nsid w:val="17F3059B"/>
     <w:multiLevelType w:val="multilevel"/>
     <w:tmpl w:val="73982934"/>
@@ -3968,7 +5163,7 @@
       </w:pPr>
     </w:lvl>
   </w:abstractNum>
-  <w:abstractNum w:abstractNumId="5" w15:restartNumberingAfterBreak="0">
+  <w:abstractNum w:abstractNumId="7" w15:restartNumberingAfterBreak="0">
     <w:nsid w:val="222E68A4"/>
     <w:multiLevelType w:val="multilevel"/>
     <w:tmpl w:val="3F54021E"/>
@@ -4081,7 +5276,7 @@
       </w:pPr>
     </w:lvl>
   </w:abstractNum>
-  <w:abstractNum w:abstractNumId="6" w15:restartNumberingAfterBreak="0">
+  <w:abstractNum w:abstractNumId="8" w15:restartNumberingAfterBreak="0">
     <w:nsid w:val="22FE1735"/>
     <w:multiLevelType w:val="multilevel"/>
     <w:tmpl w:val="0E646118"/>
@@ -4194,7 +5389,7 @@
       </w:pPr>
     </w:lvl>
   </w:abstractNum>
-  <w:abstractNum w:abstractNumId="7" w15:restartNumberingAfterBreak="0">
+  <w:abstractNum w:abstractNumId="9" w15:restartNumberingAfterBreak="0">
     <w:nsid w:val="24702608"/>
     <w:multiLevelType w:val="multilevel"/>
     <w:tmpl w:val="5FCA4700"/>
@@ -4307,7 +5502,7 @@
       </w:pPr>
     </w:lvl>
   </w:abstractNum>
-  <w:abstractNum w:abstractNumId="8" w15:restartNumberingAfterBreak="0">
+  <w:abstractNum w:abstractNumId="10" w15:restartNumberingAfterBreak="0">
     <w:nsid w:val="24BA3E95"/>
     <w:multiLevelType w:val="multilevel"/>
     <w:tmpl w:val="132CE8CE"/>
@@ -4420,7 +5615,120 @@
       </w:pPr>
     </w:lvl>
   </w:abstractNum>
-  <w:abstractNum w:abstractNumId="9" w15:restartNumberingAfterBreak="0">
+  <w:abstractNum w:abstractNumId="11" w15:restartNumberingAfterBreak="0">
+    <w:nsid w:val="27C72F1A"/>
+    <w:multiLevelType w:val="multilevel"/>
+    <w:tmpl w:val="558A0B96"/>
+    <w:lvl w:ilvl="0">
+      <w:start w:val="17"/>
+      <w:numFmt w:val="decimal"/>
+      <w:lvlText w:val="%1."/>
+      <w:lvlJc w:val="left"/>
+      <w:pPr>
+        <w:tabs>
+          <w:tab w:val="num" w:pos="720"/>
+        </w:tabs>
+        <w:ind w:left="720" w:hanging="360"/>
+      </w:pPr>
+    </w:lvl>
+    <w:lvl w:ilvl="1" w:tentative="1">
+      <w:start w:val="1"/>
+      <w:numFmt w:val="decimal"/>
+      <w:lvlText w:val="%2."/>
+      <w:lvlJc w:val="left"/>
+      <w:pPr>
+        <w:tabs>
+          <w:tab w:val="num" w:pos="1440"/>
+        </w:tabs>
+        <w:ind w:left="1440" w:hanging="360"/>
+      </w:pPr>
+    </w:lvl>
+    <w:lvl w:ilvl="2" w:tentative="1">
+      <w:start w:val="1"/>
+      <w:numFmt w:val="decimal"/>
+      <w:lvlText w:val="%3."/>
+      <w:lvlJc w:val="left"/>
+      <w:pPr>
+        <w:tabs>
+          <w:tab w:val="num" w:pos="2160"/>
+        </w:tabs>
+        <w:ind w:left="2160" w:hanging="360"/>
+      </w:pPr>
+    </w:lvl>
+    <w:lvl w:ilvl="3" w:tentative="1">
+      <w:start w:val="1"/>
+      <w:numFmt w:val="decimal"/>
+      <w:lvlText w:val="%4."/>
+      <w:lvlJc w:val="left"/>
+      <w:pPr>
+        <w:tabs>
+          <w:tab w:val="num" w:pos="2880"/>
+        </w:tabs>
+        <w:ind w:left="2880" w:hanging="360"/>
+      </w:pPr>
+    </w:lvl>
+    <w:lvl w:ilvl="4" w:tentative="1">
+      <w:start w:val="1"/>
+      <w:numFmt w:val="decimal"/>
+      <w:lvlText w:val="%5."/>
+      <w:lvlJc w:val="left"/>
+      <w:pPr>
+        <w:tabs>
+          <w:tab w:val="num" w:pos="3600"/>
+        </w:tabs>
+        <w:ind w:left="3600" w:hanging="360"/>
+      </w:pPr>
+    </w:lvl>
+    <w:lvl w:ilvl="5" w:tentative="1">
+      <w:start w:val="1"/>
+      <w:numFmt w:val="decimal"/>
+      <w:lvlText w:val="%6."/>
+      <w:lvlJc w:val="left"/>
+      <w:pPr>
+        <w:tabs>
+          <w:tab w:val="num" w:pos="4320"/>
+        </w:tabs>
+        <w:ind w:left="4320" w:hanging="360"/>
+      </w:pPr>
+    </w:lvl>
+    <w:lvl w:ilvl="6" w:tentative="1">
+      <w:start w:val="1"/>
+      <w:numFmt w:val="decimal"/>
+      <w:lvlText w:val="%7."/>
+      <w:lvlJc w:val="left"/>
+      <w:pPr>
+        <w:tabs>
+          <w:tab w:val="num" w:pos="5040"/>
+        </w:tabs>
+        <w:ind w:left="5040" w:hanging="360"/>
+      </w:pPr>
+    </w:lvl>
+    <w:lvl w:ilvl="7" w:tentative="1">
+      <w:start w:val="1"/>
+      <w:numFmt w:val="decimal"/>
+      <w:lvlText w:val="%8."/>
+      <w:lvlJc w:val="left"/>
+      <w:pPr>
+        <w:tabs>
+          <w:tab w:val="num" w:pos="5760"/>
+        </w:tabs>
+        <w:ind w:left="5760" w:hanging="360"/>
+      </w:pPr>
+    </w:lvl>
+    <w:lvl w:ilvl="8" w:tentative="1">
+      <w:start w:val="1"/>
+      <w:numFmt w:val="decimal"/>
+      <w:lvlText w:val="%9."/>
+      <w:lvlJc w:val="left"/>
+      <w:pPr>
+        <w:tabs>
+          <w:tab w:val="num" w:pos="6480"/>
+        </w:tabs>
+        <w:ind w:left="6480" w:hanging="360"/>
+      </w:pPr>
+    </w:lvl>
+  </w:abstractNum>
+  <w:abstractNum w:abstractNumId="12" w15:restartNumberingAfterBreak="0">
     <w:nsid w:val="27D831CE"/>
     <w:multiLevelType w:val="multilevel"/>
     <w:tmpl w:val="C1705C44"/>
@@ -4533,7 +5841,7 @@
       </w:pPr>
     </w:lvl>
   </w:abstractNum>
-  <w:abstractNum w:abstractNumId="10" w15:restartNumberingAfterBreak="0">
+  <w:abstractNum w:abstractNumId="13" w15:restartNumberingAfterBreak="0">
     <w:nsid w:val="29612E25"/>
     <w:multiLevelType w:val="multilevel"/>
     <w:tmpl w:val="012A15D8"/>
@@ -4646,7 +5954,7 @@
       </w:pPr>
     </w:lvl>
   </w:abstractNum>
-  <w:abstractNum w:abstractNumId="11" w15:restartNumberingAfterBreak="0">
+  <w:abstractNum w:abstractNumId="14" w15:restartNumberingAfterBreak="0">
     <w:nsid w:val="2E925B03"/>
     <w:multiLevelType w:val="multilevel"/>
     <w:tmpl w:val="AA807808"/>
@@ -4759,7 +6067,7 @@
       </w:pPr>
     </w:lvl>
   </w:abstractNum>
-  <w:abstractNum w:abstractNumId="12" w15:restartNumberingAfterBreak="0">
+  <w:abstractNum w:abstractNumId="15" w15:restartNumberingAfterBreak="0">
     <w:nsid w:val="3129265C"/>
     <w:multiLevelType w:val="multilevel"/>
     <w:tmpl w:val="BFCA5AAA"/>
@@ -4872,7 +6180,7 @@
       </w:pPr>
     </w:lvl>
   </w:abstractNum>
-  <w:abstractNum w:abstractNumId="13" w15:restartNumberingAfterBreak="0">
+  <w:abstractNum w:abstractNumId="16" w15:restartNumberingAfterBreak="0">
     <w:nsid w:val="3468417B"/>
     <w:multiLevelType w:val="multilevel"/>
     <w:tmpl w:val="8AB82338"/>
@@ -4985,7 +6293,7 @@
       </w:pPr>
     </w:lvl>
   </w:abstractNum>
-  <w:abstractNum w:abstractNumId="14" w15:restartNumberingAfterBreak="0">
+  <w:abstractNum w:abstractNumId="17" w15:restartNumberingAfterBreak="0">
     <w:nsid w:val="3573365C"/>
     <w:multiLevelType w:val="multilevel"/>
     <w:tmpl w:val="55BA23A0"/>
@@ -5098,7 +6406,120 @@
       </w:pPr>
     </w:lvl>
   </w:abstractNum>
-  <w:abstractNum w:abstractNumId="15" w15:restartNumberingAfterBreak="0">
+  <w:abstractNum w:abstractNumId="18" w15:restartNumberingAfterBreak="0">
+    <w:nsid w:val="37E21447"/>
+    <w:multiLevelType w:val="multilevel"/>
+    <w:tmpl w:val="16283EAA"/>
+    <w:lvl w:ilvl="0">
+      <w:start w:val="15"/>
+      <w:numFmt w:val="decimal"/>
+      <w:lvlText w:val="%1."/>
+      <w:lvlJc w:val="left"/>
+      <w:pPr>
+        <w:tabs>
+          <w:tab w:val="num" w:pos="720"/>
+        </w:tabs>
+        <w:ind w:left="720" w:hanging="360"/>
+      </w:pPr>
+    </w:lvl>
+    <w:lvl w:ilvl="1" w:tentative="1">
+      <w:start w:val="1"/>
+      <w:numFmt w:val="decimal"/>
+      <w:lvlText w:val="%2."/>
+      <w:lvlJc w:val="left"/>
+      <w:pPr>
+        <w:tabs>
+          <w:tab w:val="num" w:pos="1440"/>
+        </w:tabs>
+        <w:ind w:left="1440" w:hanging="360"/>
+      </w:pPr>
+    </w:lvl>
+    <w:lvl w:ilvl="2" w:tentative="1">
+      <w:start w:val="1"/>
+      <w:numFmt w:val="decimal"/>
+      <w:lvlText w:val="%3."/>
+      <w:lvlJc w:val="left"/>
+      <w:pPr>
+        <w:tabs>
+          <w:tab w:val="num" w:pos="2160"/>
+        </w:tabs>
+        <w:ind w:left="2160" w:hanging="360"/>
+      </w:pPr>
+    </w:lvl>
+    <w:lvl w:ilvl="3" w:tentative="1">
+      <w:start w:val="1"/>
+      <w:numFmt w:val="decimal"/>
+      <w:lvlText w:val="%4."/>
+      <w:lvlJc w:val="left"/>
+      <w:pPr>
+        <w:tabs>
+          <w:tab w:val="num" w:pos="2880"/>
+        </w:tabs>
+        <w:ind w:left="2880" w:hanging="360"/>
+      </w:pPr>
+    </w:lvl>
+    <w:lvl w:ilvl="4" w:tentative="1">
+      <w:start w:val="1"/>
+      <w:numFmt w:val="decimal"/>
+      <w:lvlText w:val="%5."/>
+      <w:lvlJc w:val="left"/>
+      <w:pPr>
+        <w:tabs>
+          <w:tab w:val="num" w:pos="3600"/>
+        </w:tabs>
+        <w:ind w:left="3600" w:hanging="360"/>
+      </w:pPr>
+    </w:lvl>
+    <w:lvl w:ilvl="5" w:tentative="1">
+      <w:start w:val="1"/>
+      <w:numFmt w:val="decimal"/>
+      <w:lvlText w:val="%6."/>
+      <w:lvlJc w:val="left"/>
+      <w:pPr>
+        <w:tabs>
+          <w:tab w:val="num" w:pos="4320"/>
+        </w:tabs>
+        <w:ind w:left="4320" w:hanging="360"/>
+      </w:pPr>
+    </w:lvl>
+    <w:lvl w:ilvl="6" w:tentative="1">
+      <w:start w:val="1"/>
+      <w:numFmt w:val="decimal"/>
+      <w:lvlText w:val="%7."/>
+      <w:lvlJc w:val="left"/>
+      <w:pPr>
+        <w:tabs>
+          <w:tab w:val="num" w:pos="5040"/>
+        </w:tabs>
+        <w:ind w:left="5040" w:hanging="360"/>
+      </w:pPr>
+    </w:lvl>
+    <w:lvl w:ilvl="7" w:tentative="1">
+      <w:start w:val="1"/>
+      <w:numFmt w:val="decimal"/>
+      <w:lvlText w:val="%8."/>
+      <w:lvlJc w:val="left"/>
+      <w:pPr>
+        <w:tabs>
+          <w:tab w:val="num" w:pos="5760"/>
+        </w:tabs>
+        <w:ind w:left="5760" w:hanging="360"/>
+      </w:pPr>
+    </w:lvl>
+    <w:lvl w:ilvl="8" w:tentative="1">
+      <w:start w:val="1"/>
+      <w:numFmt w:val="decimal"/>
+      <w:lvlText w:val="%9."/>
+      <w:lvlJc w:val="left"/>
+      <w:pPr>
+        <w:tabs>
+          <w:tab w:val="num" w:pos="6480"/>
+        </w:tabs>
+        <w:ind w:left="6480" w:hanging="360"/>
+      </w:pPr>
+    </w:lvl>
+  </w:abstractNum>
+  <w:abstractNum w:abstractNumId="19" w15:restartNumberingAfterBreak="0">
     <w:nsid w:val="38816D63"/>
     <w:multiLevelType w:val="multilevel"/>
     <w:tmpl w:val="7E9EEC02"/>
@@ -5211,7 +6632,7 @@
       </w:pPr>
     </w:lvl>
   </w:abstractNum>
-  <w:abstractNum w:abstractNumId="16" w15:restartNumberingAfterBreak="0">
+  <w:abstractNum w:abstractNumId="20" w15:restartNumberingAfterBreak="0">
     <w:nsid w:val="392E5190"/>
     <w:multiLevelType w:val="multilevel"/>
     <w:tmpl w:val="984E5414"/>
@@ -5324,7 +6745,7 @@
       </w:pPr>
     </w:lvl>
   </w:abstractNum>
-  <w:abstractNum w:abstractNumId="17" w15:restartNumberingAfterBreak="0">
+  <w:abstractNum w:abstractNumId="21" w15:restartNumberingAfterBreak="0">
     <w:nsid w:val="3A0C19EA"/>
     <w:multiLevelType w:val="multilevel"/>
     <w:tmpl w:val="CB46EC20"/>
@@ -5437,7 +6858,120 @@
       </w:pPr>
     </w:lvl>
   </w:abstractNum>
-  <w:abstractNum w:abstractNumId="18" w15:restartNumberingAfterBreak="0">
+  <w:abstractNum w:abstractNumId="22" w15:restartNumberingAfterBreak="0">
+    <w:nsid w:val="3A691918"/>
+    <w:multiLevelType w:val="multilevel"/>
+    <w:tmpl w:val="A5A2CE52"/>
+    <w:lvl w:ilvl="0">
+      <w:start w:val="1"/>
+      <w:numFmt w:val="decimal"/>
+      <w:lvlText w:val="%1."/>
+      <w:lvlJc w:val="left"/>
+      <w:pPr>
+        <w:tabs>
+          <w:tab w:val="num" w:pos="360"/>
+        </w:tabs>
+        <w:ind w:left="360" w:hanging="360"/>
+      </w:pPr>
+    </w:lvl>
+    <w:lvl w:ilvl="1" w:tentative="1">
+      <w:start w:val="1"/>
+      <w:numFmt w:val="decimal"/>
+      <w:lvlText w:val="%2."/>
+      <w:lvlJc w:val="left"/>
+      <w:pPr>
+        <w:tabs>
+          <w:tab w:val="num" w:pos="1080"/>
+        </w:tabs>
+        <w:ind w:left="1080" w:hanging="360"/>
+      </w:pPr>
+    </w:lvl>
+    <w:lvl w:ilvl="2" w:tentative="1">
+      <w:start w:val="1"/>
+      <w:numFmt w:val="decimal"/>
+      <w:lvlText w:val="%3."/>
+      <w:lvlJc w:val="left"/>
+      <w:pPr>
+        <w:tabs>
+          <w:tab w:val="num" w:pos="1800"/>
+        </w:tabs>
+        <w:ind w:left="1800" w:hanging="360"/>
+      </w:pPr>
+    </w:lvl>
+    <w:lvl w:ilvl="3" w:tentative="1">
+      <w:start w:val="1"/>
+      <w:numFmt w:val="decimal"/>
+      <w:lvlText w:val="%4."/>
+      <w:lvlJc w:val="left"/>
+      <w:pPr>
+        <w:tabs>
+          <w:tab w:val="num" w:pos="2520"/>
+        </w:tabs>
+        <w:ind w:left="2520" w:hanging="360"/>
+      </w:pPr>
+    </w:lvl>
+    <w:lvl w:ilvl="4" w:tentative="1">
+      <w:start w:val="1"/>
+      <w:numFmt w:val="decimal"/>
+      <w:lvlText w:val="%5."/>
+      <w:lvlJc w:val="left"/>
+      <w:pPr>
+        <w:tabs>
+          <w:tab w:val="num" w:pos="3240"/>
+        </w:tabs>
+        <w:ind w:left="3240" w:hanging="360"/>
+      </w:pPr>
+    </w:lvl>
+    <w:lvl w:ilvl="5" w:tentative="1">
+      <w:start w:val="1"/>
+      <w:numFmt w:val="decimal"/>
+      <w:lvlText w:val="%6."/>
+      <w:lvlJc w:val="left"/>
+      <w:pPr>
+        <w:tabs>
+          <w:tab w:val="num" w:pos="3960"/>
+        </w:tabs>
+        <w:ind w:left="3960" w:hanging="360"/>
+      </w:pPr>
+    </w:lvl>
+    <w:lvl w:ilvl="6" w:tentative="1">
+      <w:start w:val="1"/>
+      <w:numFmt w:val="decimal"/>
+      <w:lvlText w:val="%7."/>
+      <w:lvlJc w:val="left"/>
+      <w:pPr>
+        <w:tabs>
+          <w:tab w:val="num" w:pos="4680"/>
+        </w:tabs>
+        <w:ind w:left="4680" w:hanging="360"/>
+      </w:pPr>
+    </w:lvl>
+    <w:lvl w:ilvl="7" w:tentative="1">
+      <w:start w:val="1"/>
+      <w:numFmt w:val="decimal"/>
+      <w:lvlText w:val="%8."/>
+      <w:lvlJc w:val="left"/>
+      <w:pPr>
+        <w:tabs>
+          <w:tab w:val="num" w:pos="5400"/>
+        </w:tabs>
+        <w:ind w:left="5400" w:hanging="360"/>
+      </w:pPr>
+    </w:lvl>
+    <w:lvl w:ilvl="8" w:tentative="1">
+      <w:start w:val="1"/>
+      <w:numFmt w:val="decimal"/>
+      <w:lvlText w:val="%9."/>
+      <w:lvlJc w:val="left"/>
+      <w:pPr>
+        <w:tabs>
+          <w:tab w:val="num" w:pos="6120"/>
+        </w:tabs>
+        <w:ind w:left="6120" w:hanging="360"/>
+      </w:pPr>
+    </w:lvl>
+  </w:abstractNum>
+  <w:abstractNum w:abstractNumId="23" w15:restartNumberingAfterBreak="0">
     <w:nsid w:val="3D620877"/>
     <w:multiLevelType w:val="multilevel"/>
     <w:tmpl w:val="FC4CA6AC"/>
@@ -5550,7 +7084,7 @@
       </w:pPr>
     </w:lvl>
   </w:abstractNum>
-  <w:abstractNum w:abstractNumId="19" w15:restartNumberingAfterBreak="0">
+  <w:abstractNum w:abstractNumId="24" w15:restartNumberingAfterBreak="0">
     <w:nsid w:val="3F805395"/>
     <w:multiLevelType w:val="multilevel"/>
     <w:tmpl w:val="69C63D94"/>
@@ -5663,7 +7197,7 @@
       </w:pPr>
     </w:lvl>
   </w:abstractNum>
-  <w:abstractNum w:abstractNumId="20" w15:restartNumberingAfterBreak="0">
+  <w:abstractNum w:abstractNumId="25" w15:restartNumberingAfterBreak="0">
     <w:nsid w:val="41174AE4"/>
     <w:multiLevelType w:val="multilevel"/>
     <w:tmpl w:val="90AECB32"/>
@@ -5776,7 +7310,7 @@
       </w:pPr>
     </w:lvl>
   </w:abstractNum>
-  <w:abstractNum w:abstractNumId="21" w15:restartNumberingAfterBreak="0">
+  <w:abstractNum w:abstractNumId="26" w15:restartNumberingAfterBreak="0">
     <w:nsid w:val="424A5B36"/>
     <w:multiLevelType w:val="multilevel"/>
     <w:tmpl w:val="F41ED414"/>
@@ -5889,7 +7423,7 @@
       </w:pPr>
     </w:lvl>
   </w:abstractNum>
-  <w:abstractNum w:abstractNumId="22" w15:restartNumberingAfterBreak="0">
+  <w:abstractNum w:abstractNumId="27" w15:restartNumberingAfterBreak="0">
     <w:nsid w:val="47E43FD8"/>
     <w:multiLevelType w:val="multilevel"/>
     <w:tmpl w:val="E7205AC4"/>
@@ -6002,7 +7536,120 @@
       </w:pPr>
     </w:lvl>
   </w:abstractNum>
-  <w:abstractNum w:abstractNumId="23" w15:restartNumberingAfterBreak="0">
+  <w:abstractNum w:abstractNumId="28" w15:restartNumberingAfterBreak="0">
+    <w:nsid w:val="4961564A"/>
+    <w:multiLevelType w:val="multilevel"/>
+    <w:tmpl w:val="1EE47EDA"/>
+    <w:lvl w:ilvl="0">
+      <w:start w:val="12"/>
+      <w:numFmt w:val="decimal"/>
+      <w:lvlText w:val="%1."/>
+      <w:lvlJc w:val="left"/>
+      <w:pPr>
+        <w:tabs>
+          <w:tab w:val="num" w:pos="720"/>
+        </w:tabs>
+        <w:ind w:left="720" w:hanging="360"/>
+      </w:pPr>
+    </w:lvl>
+    <w:lvl w:ilvl="1" w:tentative="1">
+      <w:start w:val="1"/>
+      <w:numFmt w:val="decimal"/>
+      <w:lvlText w:val="%2."/>
+      <w:lvlJc w:val="left"/>
+      <w:pPr>
+        <w:tabs>
+          <w:tab w:val="num" w:pos="1440"/>
+        </w:tabs>
+        <w:ind w:left="1440" w:hanging="360"/>
+      </w:pPr>
+    </w:lvl>
+    <w:lvl w:ilvl="2" w:tentative="1">
+      <w:start w:val="1"/>
+      <w:numFmt w:val="decimal"/>
+      <w:lvlText w:val="%3."/>
+      <w:lvlJc w:val="left"/>
+      <w:pPr>
+        <w:tabs>
+          <w:tab w:val="num" w:pos="2160"/>
+        </w:tabs>
+        <w:ind w:left="2160" w:hanging="360"/>
+      </w:pPr>
+    </w:lvl>
+    <w:lvl w:ilvl="3" w:tentative="1">
+      <w:start w:val="1"/>
+      <w:numFmt w:val="decimal"/>
+      <w:lvlText w:val="%4."/>
+      <w:lvlJc w:val="left"/>
+      <w:pPr>
+        <w:tabs>
+          <w:tab w:val="num" w:pos="2880"/>
+        </w:tabs>
+        <w:ind w:left="2880" w:hanging="360"/>
+      </w:pPr>
+    </w:lvl>
+    <w:lvl w:ilvl="4" w:tentative="1">
+      <w:start w:val="1"/>
+      <w:numFmt w:val="decimal"/>
+      <w:lvlText w:val="%5."/>
+      <w:lvlJc w:val="left"/>
+      <w:pPr>
+        <w:tabs>
+          <w:tab w:val="num" w:pos="3600"/>
+        </w:tabs>
+        <w:ind w:left="3600" w:hanging="360"/>
+      </w:pPr>
+    </w:lvl>
+    <w:lvl w:ilvl="5" w:tentative="1">
+      <w:start w:val="1"/>
+      <w:numFmt w:val="decimal"/>
+      <w:lvlText w:val="%6."/>
+      <w:lvlJc w:val="left"/>
+      <w:pPr>
+        <w:tabs>
+          <w:tab w:val="num" w:pos="4320"/>
+        </w:tabs>
+        <w:ind w:left="4320" w:hanging="360"/>
+      </w:pPr>
+    </w:lvl>
+    <w:lvl w:ilvl="6" w:tentative="1">
+      <w:start w:val="1"/>
+      <w:numFmt w:val="decimal"/>
+      <w:lvlText w:val="%7."/>
+      <w:lvlJc w:val="left"/>
+      <w:pPr>
+        <w:tabs>
+          <w:tab w:val="num" w:pos="5040"/>
+        </w:tabs>
+        <w:ind w:left="5040" w:hanging="360"/>
+      </w:pPr>
+    </w:lvl>
+    <w:lvl w:ilvl="7" w:tentative="1">
+      <w:start w:val="1"/>
+      <w:numFmt w:val="decimal"/>
+      <w:lvlText w:val="%8."/>
+      <w:lvlJc w:val="left"/>
+      <w:pPr>
+        <w:tabs>
+          <w:tab w:val="num" w:pos="5760"/>
+        </w:tabs>
+        <w:ind w:left="5760" w:hanging="360"/>
+      </w:pPr>
+    </w:lvl>
+    <w:lvl w:ilvl="8" w:tentative="1">
+      <w:start w:val="1"/>
+      <w:numFmt w:val="decimal"/>
+      <w:lvlText w:val="%9."/>
+      <w:lvlJc w:val="left"/>
+      <w:pPr>
+        <w:tabs>
+          <w:tab w:val="num" w:pos="6480"/>
+        </w:tabs>
+        <w:ind w:left="6480" w:hanging="360"/>
+      </w:pPr>
+    </w:lvl>
+  </w:abstractNum>
+  <w:abstractNum w:abstractNumId="29" w15:restartNumberingAfterBreak="0">
     <w:nsid w:val="4A766284"/>
     <w:multiLevelType w:val="multilevel"/>
     <w:tmpl w:val="47A624E4"/>
@@ -6115,7 +7762,7 @@
       </w:pPr>
     </w:lvl>
   </w:abstractNum>
-  <w:abstractNum w:abstractNumId="24" w15:restartNumberingAfterBreak="0">
+  <w:abstractNum w:abstractNumId="30" w15:restartNumberingAfterBreak="0">
     <w:nsid w:val="4DFC0303"/>
     <w:multiLevelType w:val="multilevel"/>
     <w:tmpl w:val="6CB6F1DA"/>
@@ -6228,7 +7875,7 @@
       </w:pPr>
     </w:lvl>
   </w:abstractNum>
-  <w:abstractNum w:abstractNumId="25" w15:restartNumberingAfterBreak="0">
+  <w:abstractNum w:abstractNumId="31" w15:restartNumberingAfterBreak="0">
     <w:nsid w:val="5043701D"/>
     <w:multiLevelType w:val="multilevel"/>
     <w:tmpl w:val="B9767284"/>
@@ -6341,7 +7988,7 @@
       </w:pPr>
     </w:lvl>
   </w:abstractNum>
-  <w:abstractNum w:abstractNumId="26" w15:restartNumberingAfterBreak="0">
+  <w:abstractNum w:abstractNumId="32" w15:restartNumberingAfterBreak="0">
     <w:nsid w:val="51C94B40"/>
     <w:multiLevelType w:val="multilevel"/>
     <w:tmpl w:val="1486C430"/>
@@ -6454,7 +8101,7 @@
       </w:pPr>
     </w:lvl>
   </w:abstractNum>
-  <w:abstractNum w:abstractNumId="27" w15:restartNumberingAfterBreak="0">
+  <w:abstractNum w:abstractNumId="33" w15:restartNumberingAfterBreak="0">
     <w:nsid w:val="56BC2B47"/>
     <w:multiLevelType w:val="multilevel"/>
     <w:tmpl w:val="FA3A1C3E"/>
@@ -6567,7 +8214,7 @@
       </w:pPr>
     </w:lvl>
   </w:abstractNum>
-  <w:abstractNum w:abstractNumId="28" w15:restartNumberingAfterBreak="0">
+  <w:abstractNum w:abstractNumId="34" w15:restartNumberingAfterBreak="0">
     <w:nsid w:val="57D43AEC"/>
     <w:multiLevelType w:val="multilevel"/>
     <w:tmpl w:val="835A8700"/>
@@ -6680,7 +8327,7 @@
       </w:pPr>
     </w:lvl>
   </w:abstractNum>
-  <w:abstractNum w:abstractNumId="29" w15:restartNumberingAfterBreak="0">
+  <w:abstractNum w:abstractNumId="35" w15:restartNumberingAfterBreak="0">
     <w:nsid w:val="5BA87D43"/>
     <w:multiLevelType w:val="multilevel"/>
     <w:tmpl w:val="9774BE0A"/>
@@ -6793,7 +8440,7 @@
       </w:pPr>
     </w:lvl>
   </w:abstractNum>
-  <w:abstractNum w:abstractNumId="30" w15:restartNumberingAfterBreak="0">
+  <w:abstractNum w:abstractNumId="36" w15:restartNumberingAfterBreak="0">
     <w:nsid w:val="5C2F2F17"/>
     <w:multiLevelType w:val="multilevel"/>
     <w:tmpl w:val="747A114C"/>
@@ -6906,7 +8553,7 @@
       </w:pPr>
     </w:lvl>
   </w:abstractNum>
-  <w:abstractNum w:abstractNumId="31" w15:restartNumberingAfterBreak="0">
+  <w:abstractNum w:abstractNumId="37" w15:restartNumberingAfterBreak="0">
     <w:nsid w:val="5D525F40"/>
     <w:multiLevelType w:val="multilevel"/>
     <w:tmpl w:val="BC5A7E12"/>
@@ -7019,7 +8666,7 @@
       </w:pPr>
     </w:lvl>
   </w:abstractNum>
-  <w:abstractNum w:abstractNumId="32" w15:restartNumberingAfterBreak="0">
+  <w:abstractNum w:abstractNumId="38" w15:restartNumberingAfterBreak="0">
     <w:nsid w:val="5EE1349E"/>
     <w:multiLevelType w:val="multilevel"/>
     <w:tmpl w:val="9EAE0B48"/>
@@ -7132,7 +8779,7 @@
       </w:pPr>
     </w:lvl>
   </w:abstractNum>
-  <w:abstractNum w:abstractNumId="33" w15:restartNumberingAfterBreak="0">
+  <w:abstractNum w:abstractNumId="39" w15:restartNumberingAfterBreak="0">
     <w:nsid w:val="61746C75"/>
     <w:multiLevelType w:val="multilevel"/>
     <w:tmpl w:val="2C3C46EE"/>
@@ -7245,7 +8892,7 @@
       </w:pPr>
     </w:lvl>
   </w:abstractNum>
-  <w:abstractNum w:abstractNumId="34" w15:restartNumberingAfterBreak="0">
+  <w:abstractNum w:abstractNumId="40" w15:restartNumberingAfterBreak="0">
     <w:nsid w:val="61956B17"/>
     <w:multiLevelType w:val="multilevel"/>
     <w:tmpl w:val="5778E83C"/>
@@ -7358,7 +9005,7 @@
       </w:pPr>
     </w:lvl>
   </w:abstractNum>
-  <w:abstractNum w:abstractNumId="35" w15:restartNumberingAfterBreak="0">
+  <w:abstractNum w:abstractNumId="41" w15:restartNumberingAfterBreak="0">
     <w:nsid w:val="623C7211"/>
     <w:multiLevelType w:val="multilevel"/>
     <w:tmpl w:val="A7B8C8D8"/>
@@ -7471,7 +9118,7 @@
       </w:pPr>
     </w:lvl>
   </w:abstractNum>
-  <w:abstractNum w:abstractNumId="36" w15:restartNumberingAfterBreak="0">
+  <w:abstractNum w:abstractNumId="42" w15:restartNumberingAfterBreak="0">
     <w:nsid w:val="66285F85"/>
     <w:multiLevelType w:val="multilevel"/>
     <w:tmpl w:val="7402EE4C"/>
@@ -7584,7 +9231,7 @@
       </w:pPr>
     </w:lvl>
   </w:abstractNum>
-  <w:abstractNum w:abstractNumId="37" w15:restartNumberingAfterBreak="0">
+  <w:abstractNum w:abstractNumId="43" w15:restartNumberingAfterBreak="0">
     <w:nsid w:val="675459F4"/>
     <w:multiLevelType w:val="multilevel"/>
     <w:tmpl w:val="7958B320"/>
@@ -7697,7 +9344,7 @@
       </w:pPr>
     </w:lvl>
   </w:abstractNum>
-  <w:abstractNum w:abstractNumId="38" w15:restartNumberingAfterBreak="0">
+  <w:abstractNum w:abstractNumId="44" w15:restartNumberingAfterBreak="0">
     <w:nsid w:val="67F74832"/>
     <w:multiLevelType w:val="multilevel"/>
     <w:tmpl w:val="B4884122"/>
@@ -7810,7 +9457,7 @@
       </w:pPr>
     </w:lvl>
   </w:abstractNum>
-  <w:abstractNum w:abstractNumId="39" w15:restartNumberingAfterBreak="0">
+  <w:abstractNum w:abstractNumId="45" w15:restartNumberingAfterBreak="0">
     <w:nsid w:val="6A4C38E4"/>
     <w:multiLevelType w:val="multilevel"/>
     <w:tmpl w:val="A6E2C220"/>
@@ -7923,7 +9570,7 @@
       </w:pPr>
     </w:lvl>
   </w:abstractNum>
-  <w:abstractNum w:abstractNumId="40" w15:restartNumberingAfterBreak="0">
+  <w:abstractNum w:abstractNumId="46" w15:restartNumberingAfterBreak="0">
     <w:nsid w:val="6AAF785C"/>
     <w:multiLevelType w:val="multilevel"/>
     <w:tmpl w:val="58287B4C"/>
@@ -8036,7 +9683,7 @@
       </w:pPr>
     </w:lvl>
   </w:abstractNum>
-  <w:abstractNum w:abstractNumId="41" w15:restartNumberingAfterBreak="0">
+  <w:abstractNum w:abstractNumId="47" w15:restartNumberingAfterBreak="0">
     <w:nsid w:val="6CAC4A5D"/>
     <w:multiLevelType w:val="multilevel"/>
     <w:tmpl w:val="36FA83D6"/>
@@ -8149,7 +9796,7 @@
       </w:pPr>
     </w:lvl>
   </w:abstractNum>
-  <w:abstractNum w:abstractNumId="42" w15:restartNumberingAfterBreak="0">
+  <w:abstractNum w:abstractNumId="48" w15:restartNumberingAfterBreak="0">
     <w:nsid w:val="6FB54FF9"/>
     <w:multiLevelType w:val="multilevel"/>
     <w:tmpl w:val="8A5C63CA"/>
@@ -8262,7 +9909,120 @@
       </w:pPr>
     </w:lvl>
   </w:abstractNum>
-  <w:abstractNum w:abstractNumId="43" w15:restartNumberingAfterBreak="0">
+  <w:abstractNum w:abstractNumId="49" w15:restartNumberingAfterBreak="0">
+    <w:nsid w:val="705131D9"/>
+    <w:multiLevelType w:val="multilevel"/>
+    <w:tmpl w:val="3E607406"/>
+    <w:lvl w:ilvl="0">
+      <w:start w:val="14"/>
+      <w:numFmt w:val="decimal"/>
+      <w:lvlText w:val="%1."/>
+      <w:lvlJc w:val="left"/>
+      <w:pPr>
+        <w:tabs>
+          <w:tab w:val="num" w:pos="720"/>
+        </w:tabs>
+        <w:ind w:left="720" w:hanging="360"/>
+      </w:pPr>
+    </w:lvl>
+    <w:lvl w:ilvl="1" w:tentative="1">
+      <w:start w:val="1"/>
+      <w:numFmt w:val="decimal"/>
+      <w:lvlText w:val="%2."/>
+      <w:lvlJc w:val="left"/>
+      <w:pPr>
+        <w:tabs>
+          <w:tab w:val="num" w:pos="1440"/>
+        </w:tabs>
+        <w:ind w:left="1440" w:hanging="360"/>
+      </w:pPr>
+    </w:lvl>
+    <w:lvl w:ilvl="2" w:tentative="1">
+      <w:start w:val="1"/>
+      <w:numFmt w:val="decimal"/>
+      <w:lvlText w:val="%3."/>
+      <w:lvlJc w:val="left"/>
+      <w:pPr>
+        <w:tabs>
+          <w:tab w:val="num" w:pos="2160"/>
+        </w:tabs>
+        <w:ind w:left="2160" w:hanging="360"/>
+      </w:pPr>
+    </w:lvl>
+    <w:lvl w:ilvl="3" w:tentative="1">
+      <w:start w:val="1"/>
+      <w:numFmt w:val="decimal"/>
+      <w:lvlText w:val="%4."/>
+      <w:lvlJc w:val="left"/>
+      <w:pPr>
+        <w:tabs>
+          <w:tab w:val="num" w:pos="2880"/>
+        </w:tabs>
+        <w:ind w:left="2880" w:hanging="360"/>
+      </w:pPr>
+    </w:lvl>
+    <w:lvl w:ilvl="4" w:tentative="1">
+      <w:start w:val="1"/>
+      <w:numFmt w:val="decimal"/>
+      <w:lvlText w:val="%5."/>
+      <w:lvlJc w:val="left"/>
+      <w:pPr>
+        <w:tabs>
+          <w:tab w:val="num" w:pos="3600"/>
+        </w:tabs>
+        <w:ind w:left="3600" w:hanging="360"/>
+      </w:pPr>
+    </w:lvl>
+    <w:lvl w:ilvl="5" w:tentative="1">
+      <w:start w:val="1"/>
+      <w:numFmt w:val="decimal"/>
+      <w:lvlText w:val="%6."/>
+      <w:lvlJc w:val="left"/>
+      <w:pPr>
+        <w:tabs>
+          <w:tab w:val="num" w:pos="4320"/>
+        </w:tabs>
+        <w:ind w:left="4320" w:hanging="360"/>
+      </w:pPr>
+    </w:lvl>
+    <w:lvl w:ilvl="6" w:tentative="1">
+      <w:start w:val="1"/>
+      <w:numFmt w:val="decimal"/>
+      <w:lvlText w:val="%7."/>
+      <w:lvlJc w:val="left"/>
+      <w:pPr>
+        <w:tabs>
+          <w:tab w:val="num" w:pos="5040"/>
+        </w:tabs>
+        <w:ind w:left="5040" w:hanging="360"/>
+      </w:pPr>
+    </w:lvl>
+    <w:lvl w:ilvl="7" w:tentative="1">
+      <w:start w:val="1"/>
+      <w:numFmt w:val="decimal"/>
+      <w:lvlText w:val="%8."/>
+      <w:lvlJc w:val="left"/>
+      <w:pPr>
+        <w:tabs>
+          <w:tab w:val="num" w:pos="5760"/>
+        </w:tabs>
+        <w:ind w:left="5760" w:hanging="360"/>
+      </w:pPr>
+    </w:lvl>
+    <w:lvl w:ilvl="8" w:tentative="1">
+      <w:start w:val="1"/>
+      <w:numFmt w:val="decimal"/>
+      <w:lvlText w:val="%9."/>
+      <w:lvlJc w:val="left"/>
+      <w:pPr>
+        <w:tabs>
+          <w:tab w:val="num" w:pos="6480"/>
+        </w:tabs>
+        <w:ind w:left="6480" w:hanging="360"/>
+      </w:pPr>
+    </w:lvl>
+  </w:abstractNum>
+  <w:abstractNum w:abstractNumId="50" w15:restartNumberingAfterBreak="0">
     <w:nsid w:val="72533876"/>
     <w:multiLevelType w:val="multilevel"/>
     <w:tmpl w:val="6B946BA8"/>
@@ -8375,7 +10135,7 @@
       </w:pPr>
     </w:lvl>
   </w:abstractNum>
-  <w:abstractNum w:abstractNumId="44" w15:restartNumberingAfterBreak="0">
+  <w:abstractNum w:abstractNumId="51" w15:restartNumberingAfterBreak="0">
     <w:nsid w:val="74AB0CFD"/>
     <w:multiLevelType w:val="multilevel"/>
     <w:tmpl w:val="FB3A7614"/>
@@ -8488,7 +10248,7 @@
       </w:pPr>
     </w:lvl>
   </w:abstractNum>
-  <w:abstractNum w:abstractNumId="45" w15:restartNumberingAfterBreak="0">
+  <w:abstractNum w:abstractNumId="52" w15:restartNumberingAfterBreak="0">
     <w:nsid w:val="76806856"/>
     <w:multiLevelType w:val="multilevel"/>
     <w:tmpl w:val="FE0CBFA6"/>
@@ -8601,7 +10361,7 @@
       </w:pPr>
     </w:lvl>
   </w:abstractNum>
-  <w:abstractNum w:abstractNumId="46" w15:restartNumberingAfterBreak="0">
+  <w:abstractNum w:abstractNumId="53" w15:restartNumberingAfterBreak="0">
     <w:nsid w:val="7AD46787"/>
     <w:multiLevelType w:val="multilevel"/>
     <w:tmpl w:val="FD289A4A"/>
@@ -8714,7 +10474,7 @@
       </w:pPr>
     </w:lvl>
   </w:abstractNum>
-  <w:abstractNum w:abstractNumId="47" w15:restartNumberingAfterBreak="0">
+  <w:abstractNum w:abstractNumId="54" w15:restartNumberingAfterBreak="0">
     <w:nsid w:val="7F9251B0"/>
     <w:multiLevelType w:val="multilevel"/>
     <w:tmpl w:val="4956DCEA"/>
@@ -8827,7 +10587,7 @@
       </w:pPr>
     </w:lvl>
   </w:abstractNum>
-  <w:abstractNum w:abstractNumId="48" w15:restartNumberingAfterBreak="0">
+  <w:abstractNum w:abstractNumId="55" w15:restartNumberingAfterBreak="0">
     <w:nsid w:val="7FC27D0C"/>
     <w:multiLevelType w:val="multilevel"/>
     <w:tmpl w:val="0B622B70"/>
@@ -8941,151 +10701,172 @@
     </w:lvl>
   </w:abstractNum>
   <w:num w:numId="1" w16cid:durableId="1669945602">
+    <w:abstractNumId w:val="45"/>
+  </w:num>
+  <w:num w:numId="2" w16cid:durableId="1234975221">
+    <w:abstractNumId w:val="50"/>
+  </w:num>
+  <w:num w:numId="3" w16cid:durableId="872157492">
+    <w:abstractNumId w:val="16"/>
+  </w:num>
+  <w:num w:numId="4" w16cid:durableId="1213343250">
+    <w:abstractNumId w:val="23"/>
+  </w:num>
+  <w:num w:numId="5" w16cid:durableId="1912615913">
+    <w:abstractNumId w:val="25"/>
+  </w:num>
+  <w:num w:numId="6" w16cid:durableId="1564947752">
+    <w:abstractNumId w:val="19"/>
+  </w:num>
+  <w:num w:numId="7" w16cid:durableId="1099790936">
+    <w:abstractNumId w:val="3"/>
+  </w:num>
+  <w:num w:numId="8" w16cid:durableId="1298225256">
+    <w:abstractNumId w:val="31"/>
+  </w:num>
+  <w:num w:numId="9" w16cid:durableId="1825196733">
+    <w:abstractNumId w:val="37"/>
+  </w:num>
+  <w:num w:numId="10" w16cid:durableId="1776636105">
+    <w:abstractNumId w:val="48"/>
+  </w:num>
+  <w:num w:numId="11" w16cid:durableId="744303334">
+    <w:abstractNumId w:val="42"/>
+  </w:num>
+  <w:num w:numId="12" w16cid:durableId="2025355547">
+    <w:abstractNumId w:val="40"/>
+  </w:num>
+  <w:num w:numId="13" w16cid:durableId="1344941820">
+    <w:abstractNumId w:val="41"/>
+  </w:num>
+  <w:num w:numId="14" w16cid:durableId="182596143">
+    <w:abstractNumId w:val="20"/>
+  </w:num>
+  <w:num w:numId="15" w16cid:durableId="619529366">
+    <w:abstractNumId w:val="43"/>
+  </w:num>
+  <w:num w:numId="16" w16cid:durableId="44525467">
+    <w:abstractNumId w:val="38"/>
+  </w:num>
+  <w:num w:numId="17" w16cid:durableId="303002513">
+    <w:abstractNumId w:val="44"/>
+  </w:num>
+  <w:num w:numId="18" w16cid:durableId="980385627">
+    <w:abstractNumId w:val="34"/>
+  </w:num>
+  <w:num w:numId="19" w16cid:durableId="1105077848">
+    <w:abstractNumId w:val="13"/>
+  </w:num>
+  <w:num w:numId="20" w16cid:durableId="1286082360">
+    <w:abstractNumId w:val="26"/>
+  </w:num>
+  <w:num w:numId="21" w16cid:durableId="378555905">
+    <w:abstractNumId w:val="47"/>
+  </w:num>
+  <w:num w:numId="22" w16cid:durableId="1107776108">
+    <w:abstractNumId w:val="15"/>
+  </w:num>
+  <w:num w:numId="23" w16cid:durableId="349792850">
+    <w:abstractNumId w:val="21"/>
+  </w:num>
+  <w:num w:numId="24" w16cid:durableId="361246321">
+    <w:abstractNumId w:val="8"/>
+  </w:num>
+  <w:num w:numId="25" w16cid:durableId="56324547">
+    <w:abstractNumId w:val="35"/>
+  </w:num>
+  <w:num w:numId="26" w16cid:durableId="1643538611">
+    <w:abstractNumId w:val="2"/>
+  </w:num>
+  <w:num w:numId="27" w16cid:durableId="1262027804">
+    <w:abstractNumId w:val="46"/>
+  </w:num>
+  <w:num w:numId="28" w16cid:durableId="994574476">
+    <w:abstractNumId w:val="27"/>
+  </w:num>
+  <w:num w:numId="29" w16cid:durableId="393895891">
+    <w:abstractNumId w:val="17"/>
+  </w:num>
+  <w:num w:numId="30" w16cid:durableId="1102606328">
+    <w:abstractNumId w:val="53"/>
+  </w:num>
+  <w:num w:numId="31" w16cid:durableId="154344193">
+    <w:abstractNumId w:val="36"/>
+  </w:num>
+  <w:num w:numId="32" w16cid:durableId="464930504">
+    <w:abstractNumId w:val="14"/>
+  </w:num>
+  <w:num w:numId="33" w16cid:durableId="1567834813">
+    <w:abstractNumId w:val="10"/>
+  </w:num>
+  <w:num w:numId="34" w16cid:durableId="1615399579">
+    <w:abstractNumId w:val="54"/>
+  </w:num>
+  <w:num w:numId="35" w16cid:durableId="639268322">
+    <w:abstractNumId w:val="4"/>
+  </w:num>
+  <w:num w:numId="36" w16cid:durableId="444814728">
+    <w:abstractNumId w:val="12"/>
+  </w:num>
+  <w:num w:numId="37" w16cid:durableId="2035954943">
+    <w:abstractNumId w:val="6"/>
+  </w:num>
+  <w:num w:numId="38" w16cid:durableId="1820418962">
+    <w:abstractNumId w:val="32"/>
+  </w:num>
+  <w:num w:numId="39" w16cid:durableId="1527132659">
+    <w:abstractNumId w:val="7"/>
+  </w:num>
+  <w:num w:numId="40" w16cid:durableId="1474445791">
     <w:abstractNumId w:val="39"/>
   </w:num>
-  <w:num w:numId="2" w16cid:durableId="1234975221">
-    <w:abstractNumId w:val="43"/>
+  <w:num w:numId="41" w16cid:durableId="2037929435">
+    <w:abstractNumId w:val="33"/>
   </w:num>
-  <w:num w:numId="3" w16cid:durableId="872157492">
-    <w:abstractNumId w:val="13"/>
+  <w:num w:numId="42" w16cid:durableId="1856069596">
+    <w:abstractNumId w:val="52"/>
   </w:num>
-  <w:num w:numId="4" w16cid:durableId="1213343250">
+  <w:num w:numId="43" w16cid:durableId="1880894405">
+    <w:abstractNumId w:val="24"/>
+  </w:num>
+  <w:num w:numId="44" w16cid:durableId="1958026684">
+    <w:abstractNumId w:val="30"/>
+  </w:num>
+  <w:num w:numId="45" w16cid:durableId="986009064">
+    <w:abstractNumId w:val="51"/>
+  </w:num>
+  <w:num w:numId="46" w16cid:durableId="1610505129">
+    <w:abstractNumId w:val="55"/>
+  </w:num>
+  <w:num w:numId="47" w16cid:durableId="734161034">
+    <w:abstractNumId w:val="9"/>
+  </w:num>
+  <w:num w:numId="48" w16cid:durableId="1642542804">
+    <w:abstractNumId w:val="29"/>
+  </w:num>
+  <w:num w:numId="49" w16cid:durableId="125046312">
+    <w:abstractNumId w:val="5"/>
+  </w:num>
+  <w:num w:numId="50" w16cid:durableId="1460761492">
+    <w:abstractNumId w:val="0"/>
+  </w:num>
+  <w:num w:numId="51" w16cid:durableId="141193629">
+    <w:abstractNumId w:val="28"/>
+  </w:num>
+  <w:num w:numId="52" w16cid:durableId="1074624671">
+    <w:abstractNumId w:val="49"/>
+  </w:num>
+  <w:num w:numId="53" w16cid:durableId="1139763370">
     <w:abstractNumId w:val="18"/>
   </w:num>
-  <w:num w:numId="5" w16cid:durableId="1912615913">
-    <w:abstractNumId w:val="20"/>
-  </w:num>
-  <w:num w:numId="6" w16cid:durableId="1564947752">
-    <w:abstractNumId w:val="15"/>
-  </w:num>
-  <w:num w:numId="7" w16cid:durableId="1099790936">
+  <w:num w:numId="54" w16cid:durableId="1712150694">
     <w:abstractNumId w:val="1"/>
   </w:num>
-  <w:num w:numId="8" w16cid:durableId="1298225256">
-    <w:abstractNumId w:val="25"/>
-  </w:num>
-  <w:num w:numId="9" w16cid:durableId="1825196733">
-    <w:abstractNumId w:val="31"/>
-  </w:num>
-  <w:num w:numId="10" w16cid:durableId="1776636105">
-    <w:abstractNumId w:val="42"/>
-  </w:num>
-  <w:num w:numId="11" w16cid:durableId="744303334">
-    <w:abstractNumId w:val="36"/>
-  </w:num>
-  <w:num w:numId="12" w16cid:durableId="2025355547">
-    <w:abstractNumId w:val="34"/>
-  </w:num>
-  <w:num w:numId="13" w16cid:durableId="1344941820">
-    <w:abstractNumId w:val="35"/>
-  </w:num>
-  <w:num w:numId="14" w16cid:durableId="182596143">
-    <w:abstractNumId w:val="16"/>
-  </w:num>
-  <w:num w:numId="15" w16cid:durableId="619529366">
-    <w:abstractNumId w:val="37"/>
-  </w:num>
-  <w:num w:numId="16" w16cid:durableId="44525467">
-    <w:abstractNumId w:val="32"/>
-  </w:num>
-  <w:num w:numId="17" w16cid:durableId="303002513">
-    <w:abstractNumId w:val="38"/>
-  </w:num>
-  <w:num w:numId="18" w16cid:durableId="980385627">
-    <w:abstractNumId w:val="28"/>
-  </w:num>
-  <w:num w:numId="19" w16cid:durableId="1105077848">
-    <w:abstractNumId w:val="10"/>
-  </w:num>
-  <w:num w:numId="20" w16cid:durableId="1286082360">
-    <w:abstractNumId w:val="21"/>
-  </w:num>
-  <w:num w:numId="21" w16cid:durableId="378555905">
-    <w:abstractNumId w:val="41"/>
-  </w:num>
-  <w:num w:numId="22" w16cid:durableId="1107776108">
-    <w:abstractNumId w:val="12"/>
-  </w:num>
-  <w:num w:numId="23" w16cid:durableId="349792850">
-    <w:abstractNumId w:val="17"/>
-  </w:num>
-  <w:num w:numId="24" w16cid:durableId="361246321">
-    <w:abstractNumId w:val="6"/>
-  </w:num>
-  <w:num w:numId="25" w16cid:durableId="56324547">
-    <w:abstractNumId w:val="29"/>
-  </w:num>
-  <w:num w:numId="26" w16cid:durableId="1643538611">
-    <w:abstractNumId w:val="0"/>
-  </w:num>
-  <w:num w:numId="27" w16cid:durableId="1262027804">
-    <w:abstractNumId w:val="40"/>
-  </w:num>
-  <w:num w:numId="28" w16cid:durableId="994574476">
-    <w:abstractNumId w:val="22"/>
-  </w:num>
-  <w:num w:numId="29" w16cid:durableId="393895891">
-    <w:abstractNumId w:val="14"/>
-  </w:num>
-  <w:num w:numId="30" w16cid:durableId="1102606328">
-    <w:abstractNumId w:val="46"/>
-  </w:num>
-  <w:num w:numId="31" w16cid:durableId="154344193">
-    <w:abstractNumId w:val="30"/>
-  </w:num>
-  <w:num w:numId="32" w16cid:durableId="464930504">
+  <w:num w:numId="55" w16cid:durableId="1585650467">
     <w:abstractNumId w:val="11"/>
   </w:num>
-  <w:num w:numId="33" w16cid:durableId="1567834813">
-    <w:abstractNumId w:val="8"/>
-  </w:num>
-  <w:num w:numId="34" w16cid:durableId="1615399579">
-    <w:abstractNumId w:val="47"/>
-  </w:num>
-  <w:num w:numId="35" w16cid:durableId="639268322">
-    <w:abstractNumId w:val="2"/>
-  </w:num>
-  <w:num w:numId="36" w16cid:durableId="444814728">
-    <w:abstractNumId w:val="9"/>
-  </w:num>
-  <w:num w:numId="37" w16cid:durableId="2035954943">
-    <w:abstractNumId w:val="4"/>
-  </w:num>
-  <w:num w:numId="38" w16cid:durableId="1820418962">
-    <w:abstractNumId w:val="26"/>
-  </w:num>
-  <w:num w:numId="39" w16cid:durableId="1527132659">
-    <w:abstractNumId w:val="5"/>
-  </w:num>
-  <w:num w:numId="40" w16cid:durableId="1474445791">
-    <w:abstractNumId w:val="33"/>
-  </w:num>
-  <w:num w:numId="41" w16cid:durableId="2037929435">
-    <w:abstractNumId w:val="27"/>
-  </w:num>
-  <w:num w:numId="42" w16cid:durableId="1856069596">
-    <w:abstractNumId w:val="45"/>
-  </w:num>
-  <w:num w:numId="43" w16cid:durableId="1880894405">
-    <w:abstractNumId w:val="19"/>
-  </w:num>
-  <w:num w:numId="44" w16cid:durableId="1958026684">
-    <w:abstractNumId w:val="24"/>
-  </w:num>
-  <w:num w:numId="45" w16cid:durableId="986009064">
-    <w:abstractNumId w:val="44"/>
-  </w:num>
-  <w:num w:numId="46" w16cid:durableId="1610505129">
-    <w:abstractNumId w:val="48"/>
-  </w:num>
-  <w:num w:numId="47" w16cid:durableId="734161034">
-    <w:abstractNumId w:val="7"/>
-  </w:num>
-  <w:num w:numId="48" w16cid:durableId="1642542804">
-    <w:abstractNumId w:val="23"/>
-  </w:num>
-  <w:num w:numId="49" w16cid:durableId="125046312">
-    <w:abstractNumId w:val="3"/>
+  <w:num w:numId="56" w16cid:durableId="1402606739">
+    <w:abstractNumId w:val="22"/>
   </w:num>
 </w:numbering>
 </file>
@@ -9710,7 +11491,6 @@
   <w:style w:type="character" w:default="1" w:styleId="DefaultParagraphFont">
     <w:name w:val="Default Paragraph Font"/>
     <w:uiPriority w:val="1"/>
-    <w:semiHidden/>
     <w:unhideWhenUsed/>
   </w:style>
   <w:style w:type="table" w:default="1" w:styleId="TableNormal">

</xml_diff>